<commit_message>
Data 7/3/2026 part 4
</commit_message>
<xml_diff>
--- a/Knowledge/3-Work knowledge/1-Software Engineering/2-General Technologies/9-Databases/5-My Source/2-SQL/1-Intro to SQL/2-SQL Query and Subquery.docx
+++ b/Knowledge/3-Work knowledge/1-Software Engineering/2-General Technologies/9-Databases/5-My Source/2-SQL/1-Intro to SQL/2-SQL Query and Subquery.docx
@@ -70,25 +70,7 @@
           <w:sz w:val="18"/>
           <w:highlight w:val="lightGray"/>
         </w:rPr>
-        <w:t xml:space="preserve">: Persons Table -&gt; ID Column: 1, </w:t>
-      </w:r>
-      <w:proofErr w:type="spellStart"/>
-      <w:r>
-        <w:rPr>
-          <w:color w:val="000000"/>
-          <w:sz w:val="18"/>
-          <w:highlight w:val="lightGray"/>
-        </w:rPr>
-        <w:t>Name_En</w:t>
-      </w:r>
-      <w:proofErr w:type="spellEnd"/>
-      <w:r>
-        <w:rPr>
-          <w:color w:val="000000"/>
-          <w:sz w:val="18"/>
-          <w:highlight w:val="lightGray"/>
-        </w:rPr>
-        <w:t xml:space="preserve"> Column: Motasem Essam] -&gt; </w:t>
+        <w:t xml:space="preserve">: Persons Table -&gt; ID Column: 1, Name_En Column: Motasem Essam] -&gt; </w:t>
       </w:r>
       <w:r>
         <w:rPr>
@@ -132,7 +114,6 @@
       <w:r>
         <w:rPr>
           <w:rFonts w:ascii="Roboto Mono" w:eastAsia="Roboto Mono" w:hAnsi="Roboto Mono"/>
-          <w:sz w:val="24"/>
         </w:rPr>
         <w:t xml:space="preserve">A </w:t>
       </w:r>
@@ -141,14 +122,12 @@
           <w:rFonts w:ascii="Roboto Mono" w:eastAsia="Roboto Mono" w:hAnsi="Roboto Mono"/>
           <w:b/>
           <w:bCs/>
-          <w:sz w:val="24"/>
         </w:rPr>
         <w:t>query</w:t>
       </w:r>
       <w:r>
         <w:rPr>
           <w:rFonts w:ascii="Roboto Mono" w:eastAsia="Roboto Mono" w:hAnsi="Roboto Mono"/>
-          <w:sz w:val="24"/>
         </w:rPr>
         <w:t xml:space="preserve"> is a </w:t>
       </w:r>
@@ -157,21 +136,18 @@
           <w:rFonts w:ascii="Roboto Mono" w:eastAsia="Roboto Mono" w:hAnsi="Roboto Mono"/>
           <w:b/>
           <w:bCs/>
-          <w:sz w:val="24"/>
         </w:rPr>
         <w:t>request to access or manipulate data</w:t>
       </w:r>
       <w:r>
         <w:rPr>
           <w:rFonts w:ascii="Roboto Mono" w:eastAsia="Roboto Mono" w:hAnsi="Roboto Mono"/>
-          <w:sz w:val="24"/>
         </w:rPr>
         <w:t xml:space="preserve"> in a database using SQL (Structured Query Language).</w:t>
       </w:r>
       <w:r>
         <w:rPr>
           <w:rFonts w:ascii="Roboto Mono" w:eastAsia="Roboto Mono" w:hAnsi="Roboto Mono"/>
-          <w:sz w:val="24"/>
         </w:rPr>
         <w:br/>
         <w:t xml:space="preserve"> It tells the database </w:t>
@@ -181,14 +157,12 @@
           <w:rFonts w:ascii="Roboto Mono" w:eastAsia="Roboto Mono" w:hAnsi="Roboto Mono"/>
           <w:b/>
           <w:bCs/>
-          <w:sz w:val="24"/>
         </w:rPr>
         <w:t>what data you want</w:t>
       </w:r>
       <w:r>
         <w:rPr>
           <w:rFonts w:ascii="Roboto Mono" w:eastAsia="Roboto Mono" w:hAnsi="Roboto Mono"/>
-          <w:sz w:val="24"/>
         </w:rPr>
         <w:t xml:space="preserve">, </w:t>
       </w:r>
@@ -197,14 +171,12 @@
           <w:rFonts w:ascii="Roboto Mono" w:eastAsia="Roboto Mono" w:hAnsi="Roboto Mono"/>
           <w:b/>
           <w:bCs/>
-          <w:sz w:val="24"/>
         </w:rPr>
         <w:t>how you want it</w:t>
       </w:r>
       <w:r>
         <w:rPr>
           <w:rFonts w:ascii="Roboto Mono" w:eastAsia="Roboto Mono" w:hAnsi="Roboto Mono"/>
-          <w:sz w:val="24"/>
         </w:rPr>
         <w:t xml:space="preserve">, or </w:t>
       </w:r>
@@ -213,14 +185,12 @@
           <w:rFonts w:ascii="Roboto Mono" w:eastAsia="Roboto Mono" w:hAnsi="Roboto Mono"/>
           <w:b/>
           <w:bCs/>
-          <w:sz w:val="24"/>
         </w:rPr>
         <w:t>what changes to make</w:t>
       </w:r>
       <w:r>
         <w:rPr>
           <w:rFonts w:ascii="Roboto Mono" w:eastAsia="Roboto Mono" w:hAnsi="Roboto Mono"/>
-          <w:sz w:val="24"/>
         </w:rPr>
         <w:t>.</w:t>
       </w:r>
@@ -229,9 +199,8 @@
       <w:r>
         <w:rPr>
           <w:rFonts w:ascii="Roboto Mono" w:eastAsia="Roboto Mono" w:hAnsi="Roboto Mono"/>
-          <w:sz w:val="24"/>
-        </w:rPr>
-        <w:pict w14:anchorId="5F25F8CA">
+        </w:rPr>
+        <w:pict w14:anchorId="030E3D72">
           <v:rect id="_x0000_i1025" style="width:0;height:1.5pt" o:hralign="center" o:hrstd="t" o:hr="t" fillcolor="#a0a0a0" stroked="f"/>
         </w:pict>
       </w:r>
@@ -282,25 +251,7 @@
           <w:sz w:val="18"/>
           <w:highlight w:val="lightGray"/>
         </w:rPr>
-        <w:t xml:space="preserve">: Persons Table -&gt; ID Column: 1, </w:t>
-      </w:r>
-      <w:proofErr w:type="spellStart"/>
-      <w:r>
-        <w:rPr>
-          <w:color w:val="000000"/>
-          <w:sz w:val="18"/>
-          <w:highlight w:val="lightGray"/>
-        </w:rPr>
-        <w:t>Name_En</w:t>
-      </w:r>
-      <w:proofErr w:type="spellEnd"/>
-      <w:r>
-        <w:rPr>
-          <w:color w:val="000000"/>
-          <w:sz w:val="18"/>
-          <w:highlight w:val="lightGray"/>
-        </w:rPr>
-        <w:t xml:space="preserve"> Column: Motasem Essam] -&gt; </w:t>
+        <w:t xml:space="preserve">: Persons Table -&gt; ID Column: 1, Name_En Column: Motasem Essam] -&gt; </w:t>
       </w:r>
       <w:r>
         <w:rPr>
@@ -343,7 +294,7 @@
           <w:noProof/>
         </w:rPr>
         <w:drawing>
-          <wp:inline distT="114300" distB="114300" distL="114300" distR="114300" wp14:anchorId="1581EF42" wp14:editId="34C46236">
+          <wp:inline distT="114300" distB="114300" distL="114300" distR="114300" wp14:anchorId="3F79E180" wp14:editId="41CCBA53">
             <wp:extent cx="5943600" cy="2997200"/>
             <wp:effectExtent l="0" t="0" r="0" b="0"/>
             <wp:docPr id="2" name="image6.png"/>
@@ -381,9 +332,7 @@
     </w:p>
     <w:tbl>
       <w:tblPr>
-        <w:tblStyle w:val="a"/>
         <w:tblW w:w="9360" w:type="dxa"/>
-        <w:tblInd w:w="0" w:type="dxa"/>
         <w:tblBorders>
           <w:top w:val="nil"/>
           <w:left w:val="nil"/>
@@ -429,7 +378,6 @@
                 <w:rFonts w:ascii="Roboto Mono" w:eastAsia="Roboto Mono" w:hAnsi="Roboto Mono"/>
                 <w:b/>
                 <w:bCs/>
-                <w:sz w:val="24"/>
               </w:rPr>
               <w:t>Query Type</w:t>
             </w:r>
@@ -460,7 +408,6 @@
                 <w:rFonts w:ascii="Roboto Mono" w:eastAsia="Roboto Mono" w:hAnsi="Roboto Mono"/>
                 <w:b/>
                 <w:bCs/>
-                <w:sz w:val="24"/>
               </w:rPr>
               <w:t>Purpose</w:t>
             </w:r>
@@ -491,7 +438,6 @@
                 <w:rFonts w:ascii="Roboto Mono" w:eastAsia="Roboto Mono" w:hAnsi="Roboto Mono"/>
                 <w:b/>
                 <w:bCs/>
-                <w:sz w:val="24"/>
               </w:rPr>
               <w:t>Example</w:t>
             </w:r>
@@ -524,9 +470,7 @@
                 <w:rFonts w:ascii="Roboto Mono" w:eastAsia="Roboto Mono" w:hAnsi="Roboto Mono"/>
                 <w:b/>
                 <w:bCs/>
-                <w:sz w:val="24"/>
               </w:rPr>
-              <w:lastRenderedPageBreak/>
               <w:t>SELECT</w:t>
             </w:r>
           </w:p>
@@ -551,7 +495,6 @@
             <w:r>
               <w:rPr>
                 <w:rFonts w:ascii="Roboto Mono" w:eastAsia="Roboto Mono" w:hAnsi="Roboto Mono"/>
-                <w:sz w:val="24"/>
               </w:rPr>
               <w:t>Retrieve data</w:t>
             </w:r>
@@ -578,7 +521,6 @@
               <w:rPr>
                 <w:rFonts w:ascii="Roboto Mono" w:eastAsia="Roboto Mono" w:hAnsi="Roboto Mono" w:cs="Roboto Mono"/>
                 <w:color w:val="188038"/>
-                <w:sz w:val="24"/>
               </w:rPr>
               <w:t>SELECT * FROM Customers;</w:t>
             </w:r>
@@ -611,7 +553,6 @@
                 <w:rFonts w:ascii="Roboto Mono" w:eastAsia="Roboto Mono" w:hAnsi="Roboto Mono"/>
                 <w:b/>
                 <w:bCs/>
-                <w:sz w:val="24"/>
               </w:rPr>
               <w:t>INSERT</w:t>
             </w:r>
@@ -637,7 +578,6 @@
             <w:r>
               <w:rPr>
                 <w:rFonts w:ascii="Roboto Mono" w:eastAsia="Roboto Mono" w:hAnsi="Roboto Mono"/>
-                <w:sz w:val="24"/>
               </w:rPr>
               <w:t>Add new data</w:t>
             </w:r>
@@ -664,7 +604,6 @@
               <w:rPr>
                 <w:rFonts w:ascii="Roboto Mono" w:eastAsia="Roboto Mono" w:hAnsi="Roboto Mono" w:cs="Roboto Mono"/>
                 <w:color w:val="188038"/>
-                <w:sz w:val="24"/>
               </w:rPr>
               <w:t>INSERT INTO Products (...) VALUES (...);</w:t>
             </w:r>
@@ -697,7 +636,6 @@
                 <w:rFonts w:ascii="Roboto Mono" w:eastAsia="Roboto Mono" w:hAnsi="Roboto Mono"/>
                 <w:b/>
                 <w:bCs/>
-                <w:sz w:val="24"/>
               </w:rPr>
               <w:t>UPDATE</w:t>
             </w:r>
@@ -723,7 +661,6 @@
             <w:r>
               <w:rPr>
                 <w:rFonts w:ascii="Roboto Mono" w:eastAsia="Roboto Mono" w:hAnsi="Roboto Mono"/>
-                <w:sz w:val="24"/>
               </w:rPr>
               <w:t>Modify existing data</w:t>
             </w:r>
@@ -750,7 +687,6 @@
               <w:rPr>
                 <w:rFonts w:ascii="Roboto Mono" w:eastAsia="Roboto Mono" w:hAnsi="Roboto Mono" w:cs="Roboto Mono"/>
                 <w:color w:val="188038"/>
-                <w:sz w:val="24"/>
               </w:rPr>
               <w:t>UPDATE Orders SET Status = 'Shipped';</w:t>
             </w:r>
@@ -783,7 +719,6 @@
                 <w:rFonts w:ascii="Roboto Mono" w:eastAsia="Roboto Mono" w:hAnsi="Roboto Mono"/>
                 <w:b/>
                 <w:bCs/>
-                <w:sz w:val="24"/>
               </w:rPr>
               <w:t>DELETE</w:t>
             </w:r>
@@ -809,7 +744,6 @@
             <w:r>
               <w:rPr>
                 <w:rFonts w:ascii="Roboto Mono" w:eastAsia="Roboto Mono" w:hAnsi="Roboto Mono"/>
-                <w:sz w:val="24"/>
               </w:rPr>
               <w:t>Remove data</w:t>
             </w:r>
@@ -836,7 +770,6 @@
               <w:rPr>
                 <w:rFonts w:ascii="Roboto Mono" w:eastAsia="Roboto Mono" w:hAnsi="Roboto Mono" w:cs="Roboto Mono"/>
                 <w:color w:val="188038"/>
-                <w:sz w:val="24"/>
               </w:rPr>
               <w:t>DELETE FROM Customers WHERE Country = 'USA';</w:t>
             </w:r>
@@ -869,14 +802,12 @@
                 <w:rFonts w:ascii="Roboto Mono" w:eastAsia="Roboto Mono" w:hAnsi="Roboto Mono"/>
                 <w:b/>
                 <w:bCs/>
-                <w:sz w:val="24"/>
               </w:rPr>
               <w:t>DDL</w:t>
             </w:r>
             <w:r>
               <w:rPr>
                 <w:rFonts w:ascii="Roboto Mono" w:eastAsia="Roboto Mono" w:hAnsi="Roboto Mono"/>
-                <w:sz w:val="24"/>
               </w:rPr>
               <w:t xml:space="preserve"> (e.g., CREATE, ALTER, DROP)</w:t>
             </w:r>
@@ -902,7 +833,6 @@
             <w:r>
               <w:rPr>
                 <w:rFonts w:ascii="Roboto Mono" w:eastAsia="Roboto Mono" w:hAnsi="Roboto Mono"/>
-                <w:sz w:val="24"/>
               </w:rPr>
               <w:t>Define or change structure</w:t>
             </w:r>
@@ -929,7 +859,6 @@
               <w:rPr>
                 <w:rFonts w:ascii="Roboto Mono" w:eastAsia="Roboto Mono" w:hAnsi="Roboto Mono" w:cs="Roboto Mono"/>
                 <w:color w:val="188038"/>
-                <w:sz w:val="24"/>
               </w:rPr>
               <w:t>CREATE TABLE Customers (...);</w:t>
             </w:r>
@@ -962,14 +891,12 @@
                 <w:rFonts w:ascii="Roboto Mono" w:eastAsia="Roboto Mono" w:hAnsi="Roboto Mono"/>
                 <w:b/>
                 <w:bCs/>
-                <w:sz w:val="24"/>
               </w:rPr>
               <w:t>TCL</w:t>
             </w:r>
             <w:r>
               <w:rPr>
                 <w:rFonts w:ascii="Roboto Mono" w:eastAsia="Roboto Mono" w:hAnsi="Roboto Mono"/>
-                <w:sz w:val="24"/>
               </w:rPr>
               <w:t xml:space="preserve"> (e.g., COMMIT, ROLLBACK)</w:t>
             </w:r>
@@ -995,7 +922,6 @@
             <w:r>
               <w:rPr>
                 <w:rFonts w:ascii="Roboto Mono" w:eastAsia="Roboto Mono" w:hAnsi="Roboto Mono"/>
-                <w:sz w:val="24"/>
               </w:rPr>
               <w:t>Manage transactions</w:t>
             </w:r>
@@ -1022,7 +948,6 @@
               <w:rPr>
                 <w:rFonts w:ascii="Roboto Mono" w:eastAsia="Roboto Mono" w:hAnsi="Roboto Mono" w:cs="Roboto Mono"/>
                 <w:color w:val="188038"/>
-                <w:sz w:val="24"/>
               </w:rPr>
               <w:t>COMMIT;</w:t>
             </w:r>
@@ -1055,14 +980,12 @@
                 <w:rFonts w:ascii="Roboto Mono" w:eastAsia="Roboto Mono" w:hAnsi="Roboto Mono"/>
                 <w:b/>
                 <w:bCs/>
-                <w:sz w:val="24"/>
               </w:rPr>
               <w:t>DCL</w:t>
             </w:r>
             <w:r>
               <w:rPr>
                 <w:rFonts w:ascii="Roboto Mono" w:eastAsia="Roboto Mono" w:hAnsi="Roboto Mono"/>
-                <w:sz w:val="24"/>
               </w:rPr>
               <w:t xml:space="preserve"> (e.g., GRANT, REVOKE)</w:t>
             </w:r>
@@ -1088,7 +1011,6 @@
             <w:r>
               <w:rPr>
                 <w:rFonts w:ascii="Roboto Mono" w:eastAsia="Roboto Mono" w:hAnsi="Roboto Mono"/>
-                <w:sz w:val="24"/>
               </w:rPr>
               <w:t>Control permissions</w:t>
             </w:r>
@@ -1115,7 +1037,6 @@
               <w:rPr>
                 <w:rFonts w:ascii="Roboto Mono" w:eastAsia="Roboto Mono" w:hAnsi="Roboto Mono" w:cs="Roboto Mono"/>
                 <w:color w:val="188038"/>
-                <w:sz w:val="24"/>
               </w:rPr>
               <w:t>GRANT SELECT ON db.* TO 'user';</w:t>
             </w:r>
@@ -1127,9 +1048,8 @@
       <w:r>
         <w:rPr>
           <w:rFonts w:ascii="Roboto Mono" w:eastAsia="Roboto Mono" w:hAnsi="Roboto Mono"/>
-          <w:sz w:val="24"/>
-        </w:rPr>
-        <w:pict w14:anchorId="6CF88409">
+        </w:rPr>
+        <w:pict w14:anchorId="5457E706">
           <v:rect id="_x0000_i1026" style="width:0;height:1.5pt" o:hralign="center" o:hrstd="t" o:hr="t" fillcolor="#a0a0a0" stroked="f"/>
         </w:pict>
       </w:r>
@@ -1201,25 +1121,7 @@
           <w:sz w:val="18"/>
           <w:highlight w:val="lightGray"/>
         </w:rPr>
-        <w:t xml:space="preserve">: Persons Table -&gt; ID Column: 1, </w:t>
-      </w:r>
-      <w:proofErr w:type="spellStart"/>
-      <w:r>
-        <w:rPr>
-          <w:color w:val="000000"/>
-          <w:sz w:val="18"/>
-          <w:highlight w:val="lightGray"/>
-        </w:rPr>
-        <w:t>Name_En</w:t>
-      </w:r>
-      <w:proofErr w:type="spellEnd"/>
-      <w:r>
-        <w:rPr>
-          <w:color w:val="000000"/>
-          <w:sz w:val="18"/>
-          <w:highlight w:val="lightGray"/>
-        </w:rPr>
-        <w:t xml:space="preserve"> Column: Motasem Essam] -&gt; </w:t>
+        <w:t xml:space="preserve">: Persons Table -&gt; ID Column: 1, Name_En Column: Motasem Essam] -&gt; </w:t>
       </w:r>
       <w:r>
         <w:rPr>
@@ -1262,7 +1164,7 @@
           <w:noProof/>
         </w:rPr>
         <w:drawing>
-          <wp:inline distT="114300" distB="114300" distL="114300" distR="114300" wp14:anchorId="14EE45FB" wp14:editId="13FF79A4">
+          <wp:inline distT="114300" distB="114300" distL="114300" distR="114300" wp14:anchorId="6614DF49" wp14:editId="49C6EB41">
             <wp:extent cx="5943600" cy="1612900"/>
             <wp:effectExtent l="0" t="0" r="0" b="0"/>
             <wp:docPr id="1" name="image9.png"/>
@@ -1302,7 +1204,6 @@
       <w:r>
         <w:rPr>
           <w:rFonts w:ascii="Roboto Mono" w:eastAsia="Roboto Mono" w:hAnsi="Roboto Mono"/>
-          <w:sz w:val="24"/>
         </w:rPr>
         <w:t>SELECT column1, column2</w:t>
       </w:r>
@@ -1311,25 +1212,14 @@
       <w:r>
         <w:rPr>
           <w:rFonts w:ascii="Roboto Mono" w:eastAsia="Roboto Mono" w:hAnsi="Roboto Mono"/>
-          <w:sz w:val="24"/>
-        </w:rPr>
-        <w:t xml:space="preserve">FROM </w:t>
-      </w:r>
-      <w:proofErr w:type="spellStart"/>
-      <w:r>
-        <w:rPr>
-          <w:rFonts w:ascii="Roboto Mono" w:eastAsia="Roboto Mono" w:hAnsi="Roboto Mono"/>
-          <w:sz w:val="24"/>
-        </w:rPr>
-        <w:t>table_name</w:t>
-      </w:r>
-      <w:proofErr w:type="spellEnd"/>
-    </w:p>
-    <w:p>
-      <w:r>
-        <w:rPr>
-          <w:rFonts w:ascii="Roboto Mono" w:eastAsia="Roboto Mono" w:hAnsi="Roboto Mono"/>
-          <w:sz w:val="24"/>
+        </w:rPr>
+        <w:t>FROM table_name</w:t>
+      </w:r>
+    </w:p>
+    <w:p>
+      <w:r>
+        <w:rPr>
+          <w:rFonts w:ascii="Roboto Mono" w:eastAsia="Roboto Mono" w:hAnsi="Roboto Mono"/>
         </w:rPr>
         <w:t>WHERE condition</w:t>
       </w:r>
@@ -1338,7 +1228,6 @@
       <w:r>
         <w:rPr>
           <w:rFonts w:ascii="Roboto Mono" w:eastAsia="Roboto Mono" w:hAnsi="Roboto Mono"/>
-          <w:sz w:val="24"/>
         </w:rPr>
         <w:t>GROUP BY column</w:t>
       </w:r>
@@ -1347,9 +1236,7 @@
       <w:r>
         <w:rPr>
           <w:rFonts w:ascii="Roboto Mono" w:eastAsia="Roboto Mono" w:hAnsi="Roboto Mono"/>
-          <w:sz w:val="24"/>
-        </w:rPr>
-        <w:lastRenderedPageBreak/>
+        </w:rPr>
         <w:t>HAVING condition</w:t>
       </w:r>
     </w:p>
@@ -1357,7 +1244,6 @@
       <w:r>
         <w:rPr>
           <w:rFonts w:ascii="Roboto Mono" w:eastAsia="Roboto Mono" w:hAnsi="Roboto Mono"/>
-          <w:sz w:val="24"/>
         </w:rPr>
         <w:t>ORDER BY column;</w:t>
       </w:r>
@@ -1367,9 +1253,8 @@
       <w:r>
         <w:rPr>
           <w:rFonts w:ascii="Roboto Mono" w:eastAsia="Roboto Mono" w:hAnsi="Roboto Mono"/>
-          <w:sz w:val="24"/>
-        </w:rPr>
-        <w:pict w14:anchorId="4AEA38AF">
+        </w:rPr>
+        <w:pict w14:anchorId="4B46BC41">
           <v:rect id="_x0000_i1027" style="width:0;height:1.5pt" o:hralign="center" o:hrstd="t" o:hr="t" fillcolor="#a0a0a0" stroked="f"/>
         </w:pict>
       </w:r>
@@ -1420,25 +1305,7 @@
           <w:sz w:val="18"/>
           <w:highlight w:val="lightGray"/>
         </w:rPr>
-        <w:t xml:space="preserve">: Persons Table -&gt; ID Column: 1, </w:t>
-      </w:r>
-      <w:proofErr w:type="spellStart"/>
-      <w:r>
-        <w:rPr>
-          <w:color w:val="000000"/>
-          <w:sz w:val="18"/>
-          <w:highlight w:val="lightGray"/>
-        </w:rPr>
-        <w:t>Name_En</w:t>
-      </w:r>
-      <w:proofErr w:type="spellEnd"/>
-      <w:r>
-        <w:rPr>
-          <w:color w:val="000000"/>
-          <w:sz w:val="18"/>
-          <w:highlight w:val="lightGray"/>
-        </w:rPr>
-        <w:t xml:space="preserve"> Column: Motasem Essam] -&gt; </w:t>
+        <w:t xml:space="preserve">: Persons Table -&gt; ID Column: 1, Name_En Column: Motasem Essam] -&gt; </w:t>
       </w:r>
       <w:r>
         <w:rPr>
@@ -1481,7 +1348,7 @@
           <w:noProof/>
         </w:rPr>
         <w:drawing>
-          <wp:inline distT="114300" distB="114300" distL="114300" distR="114300" wp14:anchorId="168D5C95" wp14:editId="48256CC9">
+          <wp:inline distT="114300" distB="114300" distL="114300" distR="114300" wp14:anchorId="6F3C007D" wp14:editId="6BEBC07B">
             <wp:extent cx="5943600" cy="1206500"/>
             <wp:effectExtent l="0" t="0" r="0" b="0"/>
             <wp:docPr id="8" name="image4.png"/>
@@ -1521,32 +1388,14 @@
       <w:r>
         <w:rPr>
           <w:rFonts w:ascii="Roboto Mono" w:eastAsia="Roboto Mono" w:hAnsi="Roboto Mono"/>
-          <w:sz w:val="24"/>
-        </w:rPr>
-        <w:t xml:space="preserve">SELECT </w:t>
-      </w:r>
-      <w:proofErr w:type="spellStart"/>
-      <w:r>
-        <w:rPr>
-          <w:rFonts w:ascii="Roboto Mono" w:eastAsia="Roboto Mono" w:hAnsi="Roboto Mono"/>
-          <w:sz w:val="24"/>
-        </w:rPr>
-        <w:t>CustomerName</w:t>
-      </w:r>
-      <w:proofErr w:type="spellEnd"/>
-      <w:r>
-        <w:rPr>
-          <w:rFonts w:ascii="Roboto Mono" w:eastAsia="Roboto Mono" w:hAnsi="Roboto Mono"/>
-          <w:sz w:val="24"/>
-        </w:rPr>
-        <w:t>, City</w:t>
-      </w:r>
-    </w:p>
-    <w:p>
-      <w:r>
-        <w:rPr>
-          <w:rFonts w:ascii="Roboto Mono" w:eastAsia="Roboto Mono" w:hAnsi="Roboto Mono"/>
-          <w:sz w:val="24"/>
+        </w:rPr>
+        <w:t>SELECT CustomerName, City</w:t>
+      </w:r>
+    </w:p>
+    <w:p>
+      <w:r>
+        <w:rPr>
+          <w:rFonts w:ascii="Roboto Mono" w:eastAsia="Roboto Mono" w:hAnsi="Roboto Mono"/>
         </w:rPr>
         <w:t>FROM Customers</w:t>
       </w:r>
@@ -1555,7 +1404,6 @@
       <w:r>
         <w:rPr>
           <w:rFonts w:ascii="Roboto Mono" w:eastAsia="Roboto Mono" w:hAnsi="Roboto Mono"/>
-          <w:sz w:val="24"/>
         </w:rPr>
         <w:t>WHERE Country = 'Germany'</w:t>
       </w:r>
@@ -1564,7 +1412,6 @@
       <w:r>
         <w:rPr>
           <w:rFonts w:ascii="Roboto Mono" w:eastAsia="Roboto Mono" w:hAnsi="Roboto Mono"/>
-          <w:sz w:val="24"/>
         </w:rPr>
         <w:t>ORDER BY City;</w:t>
       </w:r>
@@ -1577,7 +1424,6 @@
       <w:r>
         <w:rPr>
           <w:rFonts w:ascii="Roboto Mono" w:eastAsia="Roboto Mono" w:hAnsi="Roboto Mono"/>
-          <w:sz w:val="24"/>
         </w:rPr>
         <w:t xml:space="preserve">🔸 This query </w:t>
       </w:r>
@@ -1586,14 +1432,12 @@
           <w:rFonts w:ascii="Roboto Mono" w:eastAsia="Roboto Mono" w:hAnsi="Roboto Mono"/>
           <w:b/>
           <w:bCs/>
-          <w:sz w:val="24"/>
         </w:rPr>
         <w:t>asks</w:t>
       </w:r>
       <w:r>
         <w:rPr>
           <w:rFonts w:ascii="Roboto Mono" w:eastAsia="Roboto Mono" w:hAnsi="Roboto Mono"/>
-          <w:sz w:val="24"/>
         </w:rPr>
         <w:t>:</w:t>
       </w:r>
@@ -1606,7 +1450,6 @@
       <w:r>
         <w:rPr>
           <w:rFonts w:ascii="Roboto Mono" w:eastAsia="Roboto Mono" w:hAnsi="Roboto Mono"/>
-          <w:sz w:val="24"/>
         </w:rPr>
         <w:t xml:space="preserve">"Give me names and cities of customers </w:t>
       </w:r>
@@ -1615,14 +1458,12 @@
           <w:rFonts w:ascii="Roboto Mono" w:eastAsia="Roboto Mono" w:hAnsi="Roboto Mono"/>
           <w:b/>
           <w:bCs/>
-          <w:sz w:val="24"/>
         </w:rPr>
         <w:t>from Germany</w:t>
       </w:r>
       <w:r>
         <w:rPr>
           <w:rFonts w:ascii="Roboto Mono" w:eastAsia="Roboto Mono" w:hAnsi="Roboto Mono"/>
-          <w:sz w:val="24"/>
         </w:rPr>
         <w:t>, ordered by city."</w:t>
       </w:r>
@@ -1631,9 +1472,8 @@
       <w:r>
         <w:rPr>
           <w:rFonts w:ascii="Roboto Mono" w:eastAsia="Roboto Mono" w:hAnsi="Roboto Mono"/>
-          <w:sz w:val="24"/>
-        </w:rPr>
-        <w:pict w14:anchorId="5ECB3EBF">
+        </w:rPr>
+        <w:pict w14:anchorId="73B0E9BE">
           <v:rect id="_x0000_i1028" style="width:0;height:1.5pt" o:hralign="center" o:hrstd="t" o:hr="t" fillcolor="#a0a0a0" stroked="f"/>
         </w:pict>
       </w:r>
@@ -1684,25 +1524,7 @@
           <w:sz w:val="18"/>
           <w:highlight w:val="lightGray"/>
         </w:rPr>
-        <w:t xml:space="preserve">: Persons Table -&gt; ID Column: 1, </w:t>
-      </w:r>
-      <w:proofErr w:type="spellStart"/>
-      <w:r>
-        <w:rPr>
-          <w:color w:val="000000"/>
-          <w:sz w:val="18"/>
-          <w:highlight w:val="lightGray"/>
-        </w:rPr>
-        <w:t>Name_En</w:t>
-      </w:r>
-      <w:proofErr w:type="spellEnd"/>
-      <w:r>
-        <w:rPr>
-          <w:color w:val="000000"/>
-          <w:sz w:val="18"/>
-          <w:highlight w:val="lightGray"/>
-        </w:rPr>
-        <w:t xml:space="preserve"> Column: Motasem Essam] -&gt; </w:t>
+        <w:t xml:space="preserve">: Persons Table -&gt; ID Column: 1, Name_En Column: Motasem Essam] -&gt; </w:t>
       </w:r>
       <w:r>
         <w:rPr>
@@ -1745,12 +1567,11 @@
           <w:ilvl w:val="0"/>
           <w:numId w:val="7"/>
         </w:numPr>
-        <w:spacing w:before="240"/>
-      </w:pPr>
-      <w:r>
-        <w:rPr>
-          <w:rFonts w:ascii="Roboto Mono" w:eastAsia="Roboto Mono" w:hAnsi="Roboto Mono"/>
-          <w:sz w:val="24"/>
+        <w:spacing w:before="240" w:after="0" w:line="276" w:lineRule="auto"/>
+      </w:pPr>
+      <w:r>
+        <w:rPr>
+          <w:rFonts w:ascii="Roboto Mono" w:eastAsia="Roboto Mono" w:hAnsi="Roboto Mono"/>
         </w:rPr>
         <w:t xml:space="preserve">A </w:t>
       </w:r>
@@ -1759,14 +1580,12 @@
           <w:rFonts w:ascii="Roboto Mono" w:eastAsia="Roboto Mono" w:hAnsi="Roboto Mono"/>
           <w:b/>
           <w:bCs/>
-          <w:sz w:val="24"/>
         </w:rPr>
         <w:t>query</w:t>
       </w:r>
       <w:r>
         <w:rPr>
           <w:rFonts w:ascii="Roboto Mono" w:eastAsia="Roboto Mono" w:hAnsi="Roboto Mono"/>
-          <w:sz w:val="24"/>
         </w:rPr>
         <w:t xml:space="preserve"> is the way to </w:t>
       </w:r>
@@ -1775,21 +1594,18 @@
           <w:rFonts w:ascii="Roboto Mono" w:eastAsia="Roboto Mono" w:hAnsi="Roboto Mono"/>
           <w:b/>
           <w:bCs/>
-          <w:sz w:val="24"/>
         </w:rPr>
         <w:t>ask questions or give commands</w:t>
       </w:r>
       <w:r>
         <w:rPr>
           <w:rFonts w:ascii="Roboto Mono" w:eastAsia="Roboto Mono" w:hAnsi="Roboto Mono"/>
-          <w:sz w:val="24"/>
         </w:rPr>
         <w:t xml:space="preserve"> to a database.</w:t>
       </w:r>
       <w:r>
         <w:rPr>
           <w:rFonts w:ascii="Roboto Mono" w:eastAsia="Roboto Mono" w:hAnsi="Roboto Mono"/>
-          <w:sz w:val="24"/>
         </w:rPr>
         <w:br/>
       </w:r>
@@ -1800,18 +1616,17 @@
           <w:ilvl w:val="0"/>
           <w:numId w:val="7"/>
         </w:numPr>
-      </w:pPr>
-      <w:r>
-        <w:rPr>
-          <w:rFonts w:ascii="Roboto Mono" w:eastAsia="Roboto Mono" w:hAnsi="Roboto Mono"/>
-          <w:sz w:val="24"/>
+        <w:spacing w:after="0" w:line="276" w:lineRule="auto"/>
+      </w:pPr>
+      <w:r>
+        <w:rPr>
+          <w:rFonts w:ascii="Roboto Mono" w:eastAsia="Roboto Mono" w:hAnsi="Roboto Mono"/>
         </w:rPr>
         <w:t>It can retrieve, insert, update, delete, or define data.</w:t>
       </w:r>
       <w:r>
         <w:rPr>
           <w:rFonts w:ascii="Roboto Mono" w:eastAsia="Roboto Mono" w:hAnsi="Roboto Mono"/>
-          <w:sz w:val="24"/>
         </w:rPr>
         <w:br/>
       </w:r>
@@ -1822,22 +1637,19 @@
           <w:ilvl w:val="0"/>
           <w:numId w:val="7"/>
         </w:numPr>
-        <w:spacing w:after="240"/>
-      </w:pPr>
-      <w:r>
-        <w:rPr>
-          <w:rFonts w:ascii="Roboto Mono" w:eastAsia="Roboto Mono" w:hAnsi="Roboto Mono"/>
-          <w:b/>
-          <w:bCs/>
-          <w:sz w:val="24"/>
-        </w:rPr>
-        <w:lastRenderedPageBreak/>
+        <w:spacing w:after="240" w:line="276" w:lineRule="auto"/>
+      </w:pPr>
+      <w:r>
+        <w:rPr>
+          <w:rFonts w:ascii="Roboto Mono" w:eastAsia="Roboto Mono" w:hAnsi="Roboto Mono"/>
+          <w:b/>
+          <w:bCs/>
+        </w:rPr>
         <w:t>SQL = Query Language</w:t>
       </w:r>
       <w:r>
         <w:rPr>
           <w:rFonts w:ascii="Roboto Mono" w:eastAsia="Roboto Mono" w:hAnsi="Roboto Mono"/>
-          <w:sz w:val="24"/>
         </w:rPr>
         <w:t xml:space="preserve">, and every command you write in SQL is a </w:t>
       </w:r>
@@ -1846,21 +1658,18 @@
           <w:rFonts w:ascii="Roboto Mono" w:eastAsia="Roboto Mono" w:hAnsi="Roboto Mono"/>
           <w:b/>
           <w:bCs/>
-          <w:sz w:val="24"/>
         </w:rPr>
         <w:t>query</w:t>
       </w:r>
       <w:r>
         <w:rPr>
           <w:rFonts w:ascii="Roboto Mono" w:eastAsia="Roboto Mono" w:hAnsi="Roboto Mono"/>
-          <w:sz w:val="24"/>
         </w:rPr>
         <w:t>.</w:t>
       </w:r>
       <w:r>
         <w:rPr>
           <w:rFonts w:ascii="Roboto Mono" w:eastAsia="Roboto Mono" w:hAnsi="Roboto Mono"/>
-          <w:sz w:val="24"/>
         </w:rPr>
         <w:br/>
       </w:r>
@@ -1872,7 +1681,6 @@
       <w:r>
         <w:rPr>
           <w:rFonts w:ascii="Roboto Mono" w:eastAsia="Roboto Mono" w:hAnsi="Roboto Mono"/>
-          <w:sz w:val="24"/>
         </w:rPr>
         <w:t>Would you like to test some queries live or get practice exercises?</w:t>
       </w:r>
@@ -1936,25 +1744,7 @@
           <w:sz w:val="18"/>
           <w:highlight w:val="lightGray"/>
         </w:rPr>
-        <w:t xml:space="preserve">: Persons Table -&gt; ID Column: 1, </w:t>
-      </w:r>
-      <w:proofErr w:type="spellStart"/>
-      <w:r>
-        <w:rPr>
-          <w:color w:val="000000"/>
-          <w:sz w:val="18"/>
-          <w:highlight w:val="lightGray"/>
-        </w:rPr>
-        <w:t>Name_En</w:t>
-      </w:r>
-      <w:proofErr w:type="spellEnd"/>
-      <w:r>
-        <w:rPr>
-          <w:color w:val="000000"/>
-          <w:sz w:val="18"/>
-          <w:highlight w:val="lightGray"/>
-        </w:rPr>
-        <w:t xml:space="preserve"> Column: Motasem Essam] -&gt; </w:t>
+        <w:t xml:space="preserve">: Persons Table -&gt; ID Column: 1, Name_En Column: Motasem Essam] -&gt; </w:t>
       </w:r>
       <w:r>
         <w:rPr>
@@ -1998,7 +1788,6 @@
       <w:r>
         <w:rPr>
           <w:rFonts w:ascii="Roboto Mono" w:eastAsia="Roboto Mono" w:hAnsi="Roboto Mono"/>
-          <w:sz w:val="24"/>
         </w:rPr>
         <w:t xml:space="preserve">A </w:t>
       </w:r>
@@ -2007,14 +1796,12 @@
           <w:rFonts w:ascii="Roboto Mono" w:eastAsia="Roboto Mono" w:hAnsi="Roboto Mono"/>
           <w:b/>
           <w:bCs/>
-          <w:sz w:val="24"/>
         </w:rPr>
         <w:t>subquery</w:t>
       </w:r>
       <w:r>
         <w:rPr>
           <w:rFonts w:ascii="Roboto Mono" w:eastAsia="Roboto Mono" w:hAnsi="Roboto Mono"/>
-          <w:sz w:val="24"/>
         </w:rPr>
         <w:t xml:space="preserve"> (also called an </w:t>
       </w:r>
@@ -2023,14 +1810,12 @@
           <w:rFonts w:ascii="Roboto Mono" w:eastAsia="Roboto Mono" w:hAnsi="Roboto Mono"/>
           <w:b/>
           <w:bCs/>
-          <w:sz w:val="24"/>
         </w:rPr>
         <w:t>inner query</w:t>
       </w:r>
       <w:r>
         <w:rPr>
           <w:rFonts w:ascii="Roboto Mono" w:eastAsia="Roboto Mono" w:hAnsi="Roboto Mono"/>
-          <w:sz w:val="24"/>
         </w:rPr>
         <w:t xml:space="preserve"> or </w:t>
       </w:r>
@@ -2039,14 +1824,12 @@
           <w:rFonts w:ascii="Roboto Mono" w:eastAsia="Roboto Mono" w:hAnsi="Roboto Mono"/>
           <w:b/>
           <w:bCs/>
-          <w:sz w:val="24"/>
         </w:rPr>
         <w:t>nested query</w:t>
       </w:r>
       <w:r>
         <w:rPr>
           <w:rFonts w:ascii="Roboto Mono" w:eastAsia="Roboto Mono" w:hAnsi="Roboto Mono"/>
-          <w:sz w:val="24"/>
         </w:rPr>
         <w:t xml:space="preserve">) is a </w:t>
       </w:r>
@@ -2055,14 +1838,12 @@
           <w:rFonts w:ascii="Roboto Mono" w:eastAsia="Roboto Mono" w:hAnsi="Roboto Mono"/>
           <w:b/>
           <w:bCs/>
-          <w:sz w:val="24"/>
         </w:rPr>
         <w:t>query inside another SQL query</w:t>
       </w:r>
       <w:r>
         <w:rPr>
           <w:rFonts w:ascii="Roboto Mono" w:eastAsia="Roboto Mono" w:hAnsi="Roboto Mono"/>
-          <w:sz w:val="24"/>
         </w:rPr>
         <w:t>.</w:t>
       </w:r>
@@ -2074,7 +1855,6 @@
       <w:r>
         <w:rPr>
           <w:rFonts w:ascii="Roboto Mono" w:eastAsia="Roboto Mono" w:hAnsi="Roboto Mono"/>
-          <w:sz w:val="24"/>
         </w:rPr>
         <w:t xml:space="preserve">It returns data that the </w:t>
       </w:r>
@@ -2083,14 +1863,12 @@
           <w:rFonts w:ascii="Roboto Mono" w:eastAsia="Roboto Mono" w:hAnsi="Roboto Mono"/>
           <w:b/>
           <w:bCs/>
-          <w:sz w:val="24"/>
         </w:rPr>
         <w:t>main (outer) query</w:t>
       </w:r>
       <w:r>
         <w:rPr>
           <w:rFonts w:ascii="Roboto Mono" w:eastAsia="Roboto Mono" w:hAnsi="Roboto Mono"/>
-          <w:sz w:val="24"/>
         </w:rPr>
         <w:t xml:space="preserve"> can use in its conditions or result set.</w:t>
       </w:r>
@@ -2099,9 +1877,8 @@
       <w:r>
         <w:rPr>
           <w:rFonts w:ascii="Roboto Mono" w:eastAsia="Roboto Mono" w:hAnsi="Roboto Mono"/>
-          <w:sz w:val="24"/>
-        </w:rPr>
-        <w:pict w14:anchorId="36331C86">
+        </w:rPr>
+        <w:pict w14:anchorId="65041FF2">
           <v:rect id="_x0000_i1029" style="width:0;height:1.5pt" o:hralign="center" o:hrstd="t" o:hr="t" fillcolor="#a0a0a0" stroked="f"/>
         </w:pict>
       </w:r>
@@ -2173,25 +1950,7 @@
           <w:sz w:val="18"/>
           <w:highlight w:val="lightGray"/>
         </w:rPr>
-        <w:t xml:space="preserve">: Persons Table -&gt; ID Column: 1, </w:t>
-      </w:r>
-      <w:proofErr w:type="spellStart"/>
-      <w:r>
-        <w:rPr>
-          <w:color w:val="000000"/>
-          <w:sz w:val="18"/>
-          <w:highlight w:val="lightGray"/>
-        </w:rPr>
-        <w:t>Name_En</w:t>
-      </w:r>
-      <w:proofErr w:type="spellEnd"/>
-      <w:r>
-        <w:rPr>
-          <w:color w:val="000000"/>
-          <w:sz w:val="18"/>
-          <w:highlight w:val="lightGray"/>
-        </w:rPr>
-        <w:t xml:space="preserve"> Column: Motasem Essam] -&gt; </w:t>
+        <w:t xml:space="preserve">: Persons Table -&gt; ID Column: 1, Name_En Column: Motasem Essam] -&gt; </w:t>
       </w:r>
       <w:r>
         <w:rPr>
@@ -2234,7 +1993,7 @@
           <w:noProof/>
         </w:rPr>
         <w:drawing>
-          <wp:inline distT="114300" distB="114300" distL="114300" distR="114300" wp14:anchorId="61DA132D" wp14:editId="061E7EAB">
+          <wp:inline distT="114300" distB="114300" distL="114300" distR="114300" wp14:anchorId="4E441F4D" wp14:editId="2671A71D">
             <wp:extent cx="5943600" cy="1866900"/>
             <wp:effectExtent l="0" t="0" r="0" b="0"/>
             <wp:docPr id="5" name="image1.png"/>
@@ -2274,25 +2033,14 @@
       <w:r>
         <w:rPr>
           <w:rFonts w:ascii="Roboto Mono" w:eastAsia="Roboto Mono" w:hAnsi="Roboto Mono"/>
-          <w:sz w:val="24"/>
-        </w:rPr>
-        <w:t xml:space="preserve">SELECT </w:t>
-      </w:r>
-      <w:proofErr w:type="spellStart"/>
-      <w:r>
-        <w:rPr>
-          <w:rFonts w:ascii="Roboto Mono" w:eastAsia="Roboto Mono" w:hAnsi="Roboto Mono"/>
-          <w:sz w:val="24"/>
-        </w:rPr>
-        <w:t>CustomerName</w:t>
-      </w:r>
-      <w:proofErr w:type="spellEnd"/>
-    </w:p>
-    <w:p>
-      <w:r>
-        <w:rPr>
-          <w:rFonts w:ascii="Roboto Mono" w:eastAsia="Roboto Mono" w:hAnsi="Roboto Mono"/>
-          <w:sz w:val="24"/>
+        </w:rPr>
+        <w:t>SELECT CustomerName</w:t>
+      </w:r>
+    </w:p>
+    <w:p>
+      <w:r>
+        <w:rPr>
+          <w:rFonts w:ascii="Roboto Mono" w:eastAsia="Roboto Mono" w:hAnsi="Roboto Mono"/>
         </w:rPr>
         <w:t>FROM Customers</w:t>
       </w:r>
@@ -2301,51 +2049,22 @@
       <w:r>
         <w:rPr>
           <w:rFonts w:ascii="Roboto Mono" w:eastAsia="Roboto Mono" w:hAnsi="Roboto Mono"/>
-          <w:sz w:val="24"/>
-        </w:rPr>
-        <w:t xml:space="preserve">WHERE </w:t>
-      </w:r>
-      <w:proofErr w:type="spellStart"/>
-      <w:r>
-        <w:rPr>
-          <w:rFonts w:ascii="Roboto Mono" w:eastAsia="Roboto Mono" w:hAnsi="Roboto Mono"/>
-          <w:sz w:val="24"/>
-        </w:rPr>
-        <w:t>CustomerID</w:t>
-      </w:r>
-      <w:proofErr w:type="spellEnd"/>
-      <w:r>
-        <w:rPr>
-          <w:rFonts w:ascii="Roboto Mono" w:eastAsia="Roboto Mono" w:hAnsi="Roboto Mono"/>
-          <w:sz w:val="24"/>
-        </w:rPr>
-        <w:t xml:space="preserve"> IN (</w:t>
-      </w:r>
-    </w:p>
-    <w:p>
-      <w:r>
-        <w:rPr>
-          <w:rFonts w:ascii="Roboto Mono" w:eastAsia="Roboto Mono" w:hAnsi="Roboto Mono"/>
-          <w:sz w:val="24"/>
-        </w:rPr>
-        <w:lastRenderedPageBreak/>
-        <w:t xml:space="preserve">    SELECT </w:t>
-      </w:r>
-      <w:proofErr w:type="spellStart"/>
-      <w:r>
-        <w:rPr>
-          <w:rFonts w:ascii="Roboto Mono" w:eastAsia="Roboto Mono" w:hAnsi="Roboto Mono"/>
-          <w:sz w:val="24"/>
-        </w:rPr>
-        <w:t>CustomerID</w:t>
-      </w:r>
-      <w:proofErr w:type="spellEnd"/>
-    </w:p>
-    <w:p>
-      <w:r>
-        <w:rPr>
-          <w:rFonts w:ascii="Roboto Mono" w:eastAsia="Roboto Mono" w:hAnsi="Roboto Mono"/>
-          <w:sz w:val="24"/>
+        </w:rPr>
+        <w:t>WHERE CustomerID IN (</w:t>
+      </w:r>
+    </w:p>
+    <w:p>
+      <w:r>
+        <w:rPr>
+          <w:rFonts w:ascii="Roboto Mono" w:eastAsia="Roboto Mono" w:hAnsi="Roboto Mono"/>
+        </w:rPr>
+        <w:t xml:space="preserve">    SELECT CustomerID</w:t>
+      </w:r>
+    </w:p>
+    <w:p>
+      <w:r>
+        <w:rPr>
+          <w:rFonts w:ascii="Roboto Mono" w:eastAsia="Roboto Mono" w:hAnsi="Roboto Mono"/>
         </w:rPr>
         <w:t xml:space="preserve">    FROM Orders</w:t>
       </w:r>
@@ -2354,32 +2073,14 @@
       <w:r>
         <w:rPr>
           <w:rFonts w:ascii="Roboto Mono" w:eastAsia="Roboto Mono" w:hAnsi="Roboto Mono"/>
-          <w:sz w:val="24"/>
-        </w:rPr>
-        <w:t xml:space="preserve">    WHERE </w:t>
-      </w:r>
-      <w:proofErr w:type="spellStart"/>
-      <w:r>
-        <w:rPr>
-          <w:rFonts w:ascii="Roboto Mono" w:eastAsia="Roboto Mono" w:hAnsi="Roboto Mono"/>
-          <w:sz w:val="24"/>
-        </w:rPr>
-        <w:t>OrderDate</w:t>
-      </w:r>
-      <w:proofErr w:type="spellEnd"/>
-      <w:r>
-        <w:rPr>
-          <w:rFonts w:ascii="Roboto Mono" w:eastAsia="Roboto Mono" w:hAnsi="Roboto Mono"/>
-          <w:sz w:val="24"/>
-        </w:rPr>
-        <w:t xml:space="preserve"> &gt; '2023-01-01'</w:t>
-      </w:r>
-    </w:p>
-    <w:p>
-      <w:r>
-        <w:rPr>
-          <w:rFonts w:ascii="Roboto Mono" w:eastAsia="Roboto Mono" w:hAnsi="Roboto Mono"/>
-          <w:sz w:val="24"/>
+        </w:rPr>
+        <w:t xml:space="preserve">    WHERE OrderDate &gt; '2023-01-01'</w:t>
+      </w:r>
+    </w:p>
+    <w:p>
+      <w:r>
+        <w:rPr>
+          <w:rFonts w:ascii="Roboto Mono" w:eastAsia="Roboto Mono" w:hAnsi="Roboto Mono"/>
         </w:rPr>
         <w:t>);</w:t>
       </w:r>
@@ -2396,7 +2097,6 @@
       <w:r>
         <w:rPr>
           <w:rFonts w:ascii="Roboto Mono" w:eastAsia="Roboto Mono" w:hAnsi="Roboto Mono"/>
-          <w:sz w:val="24"/>
         </w:rPr>
         <w:t xml:space="preserve">🟡 </w:t>
       </w:r>
@@ -2405,7 +2105,6 @@
           <w:rFonts w:ascii="Roboto Mono" w:eastAsia="Roboto Mono" w:hAnsi="Roboto Mono"/>
           <w:b/>
           <w:bCs/>
-          <w:sz w:val="24"/>
         </w:rPr>
         <w:t>Explanation:</w:t>
       </w:r>
@@ -2416,12 +2115,11 @@
           <w:ilvl w:val="0"/>
           <w:numId w:val="5"/>
         </w:numPr>
-        <w:spacing w:before="240"/>
-      </w:pPr>
-      <w:r>
-        <w:rPr>
-          <w:rFonts w:ascii="Roboto Mono" w:eastAsia="Roboto Mono" w:hAnsi="Roboto Mono"/>
-          <w:sz w:val="24"/>
+        <w:spacing w:before="240" w:after="0" w:line="276" w:lineRule="auto"/>
+      </w:pPr>
+      <w:r>
+        <w:rPr>
+          <w:rFonts w:ascii="Roboto Mono" w:eastAsia="Roboto Mono" w:hAnsi="Roboto Mono"/>
         </w:rPr>
         <w:t xml:space="preserve">The subquery: </w:t>
       </w:r>
@@ -2429,33 +2127,13 @@
         <w:rPr>
           <w:rFonts w:ascii="Roboto Mono" w:eastAsia="Roboto Mono" w:hAnsi="Roboto Mono" w:cs="Roboto Mono"/>
           <w:color w:val="188038"/>
-          <w:sz w:val="24"/>
-        </w:rPr>
-        <w:t xml:space="preserve">SELECT </w:t>
-      </w:r>
-      <w:proofErr w:type="spellStart"/>
+        </w:rPr>
+        <w:t>SELECT CustomerID FROM Orders ...</w:t>
+      </w:r>
       <w:r>
         <w:rPr>
           <w:rFonts w:ascii="Roboto Mono" w:eastAsia="Roboto Mono" w:hAnsi="Roboto Mono" w:cs="Roboto Mono"/>
           <w:color w:val="188038"/>
-          <w:sz w:val="24"/>
-        </w:rPr>
-        <w:t>CustomerID</w:t>
-      </w:r>
-      <w:proofErr w:type="spellEnd"/>
-      <w:r>
-        <w:rPr>
-          <w:rFonts w:ascii="Roboto Mono" w:eastAsia="Roboto Mono" w:hAnsi="Roboto Mono" w:cs="Roboto Mono"/>
-          <w:color w:val="188038"/>
-          <w:sz w:val="24"/>
-        </w:rPr>
-        <w:t xml:space="preserve"> FROM Orders ...</w:t>
-      </w:r>
-      <w:r>
-        <w:rPr>
-          <w:rFonts w:ascii="Roboto Mono" w:eastAsia="Roboto Mono" w:hAnsi="Roboto Mono" w:cs="Roboto Mono"/>
-          <w:color w:val="188038"/>
-          <w:sz w:val="24"/>
         </w:rPr>
         <w:br/>
       </w:r>
@@ -2466,11 +2144,11 @@
           <w:ilvl w:val="0"/>
           <w:numId w:val="5"/>
         </w:numPr>
-      </w:pPr>
-      <w:r>
-        <w:rPr>
-          <w:rFonts w:ascii="Roboto Mono" w:eastAsia="Roboto Mono" w:hAnsi="Roboto Mono"/>
-          <w:sz w:val="24"/>
+        <w:spacing w:after="0" w:line="276" w:lineRule="auto"/>
+      </w:pPr>
+      <w:r>
+        <w:rPr>
+          <w:rFonts w:ascii="Roboto Mono" w:eastAsia="Roboto Mono" w:hAnsi="Roboto Mono"/>
         </w:rPr>
         <w:t xml:space="preserve">It runs </w:t>
       </w:r>
@@ -2479,21 +2157,18 @@
           <w:rFonts w:ascii="Roboto Mono" w:eastAsia="Roboto Mono" w:hAnsi="Roboto Mono"/>
           <w:b/>
           <w:bCs/>
-          <w:sz w:val="24"/>
         </w:rPr>
         <w:t>first</w:t>
       </w:r>
       <w:r>
         <w:rPr>
           <w:rFonts w:ascii="Roboto Mono" w:eastAsia="Roboto Mono" w:hAnsi="Roboto Mono"/>
-          <w:sz w:val="24"/>
         </w:rPr>
         <w:t xml:space="preserve"> and returns customer IDs.</w:t>
       </w:r>
       <w:r>
         <w:rPr>
           <w:rFonts w:ascii="Roboto Mono" w:eastAsia="Roboto Mono" w:hAnsi="Roboto Mono"/>
-          <w:sz w:val="24"/>
         </w:rPr>
         <w:br/>
       </w:r>
@@ -2504,12 +2179,11 @@
           <w:ilvl w:val="0"/>
           <w:numId w:val="5"/>
         </w:numPr>
-        <w:spacing w:after="240"/>
-      </w:pPr>
-      <w:r>
-        <w:rPr>
-          <w:rFonts w:ascii="Roboto Mono" w:eastAsia="Roboto Mono" w:hAnsi="Roboto Mono"/>
-          <w:sz w:val="24"/>
+        <w:spacing w:after="240" w:line="276" w:lineRule="auto"/>
+      </w:pPr>
+      <w:r>
+        <w:rPr>
+          <w:rFonts w:ascii="Roboto Mono" w:eastAsia="Roboto Mono" w:hAnsi="Roboto Mono"/>
         </w:rPr>
         <w:t xml:space="preserve">The outer query: selects names of </w:t>
       </w:r>
@@ -2518,21 +2192,18 @@
           <w:rFonts w:ascii="Roboto Mono" w:eastAsia="Roboto Mono" w:hAnsi="Roboto Mono"/>
           <w:b/>
           <w:bCs/>
-          <w:sz w:val="24"/>
         </w:rPr>
         <w:t>those customers</w:t>
       </w:r>
       <w:r>
         <w:rPr>
           <w:rFonts w:ascii="Roboto Mono" w:eastAsia="Roboto Mono" w:hAnsi="Roboto Mono"/>
-          <w:sz w:val="24"/>
         </w:rPr>
         <w:t>.</w:t>
       </w:r>
       <w:r>
         <w:rPr>
           <w:rFonts w:ascii="Roboto Mono" w:eastAsia="Roboto Mono" w:hAnsi="Roboto Mono"/>
-          <w:sz w:val="24"/>
         </w:rPr>
         <w:br/>
       </w:r>
@@ -2541,9 +2212,8 @@
       <w:r>
         <w:rPr>
           <w:rFonts w:ascii="Roboto Mono" w:eastAsia="Roboto Mono" w:hAnsi="Roboto Mono"/>
-          <w:sz w:val="24"/>
-        </w:rPr>
-        <w:pict w14:anchorId="5AEE0703">
+        </w:rPr>
+        <w:pict w14:anchorId="6A4A85EA">
           <v:rect id="_x0000_i1030" style="width:0;height:1.5pt" o:hralign="center" o:hrstd="t" o:hr="t" fillcolor="#a0a0a0" stroked="f"/>
         </w:pict>
       </w:r>
@@ -2594,25 +2264,7 @@
           <w:sz w:val="18"/>
           <w:highlight w:val="lightGray"/>
         </w:rPr>
-        <w:t xml:space="preserve">: Persons Table -&gt; ID Column: 1, </w:t>
-      </w:r>
-      <w:proofErr w:type="spellStart"/>
-      <w:r>
-        <w:rPr>
-          <w:color w:val="000000"/>
-          <w:sz w:val="18"/>
-          <w:highlight w:val="lightGray"/>
-        </w:rPr>
-        <w:t>Name_En</w:t>
-      </w:r>
-      <w:proofErr w:type="spellEnd"/>
-      <w:r>
-        <w:rPr>
-          <w:color w:val="000000"/>
-          <w:sz w:val="18"/>
-          <w:highlight w:val="lightGray"/>
-        </w:rPr>
-        <w:t xml:space="preserve"> Column: Motasem Essam] -&gt; </w:t>
+        <w:t xml:space="preserve">: Persons Table -&gt; ID Column: 1, Name_En Column: Motasem Essam] -&gt; </w:t>
       </w:r>
       <w:r>
         <w:rPr>
@@ -2655,7 +2307,7 @@
           <w:noProof/>
         </w:rPr>
         <w:drawing>
-          <wp:inline distT="114300" distB="114300" distL="114300" distR="114300" wp14:anchorId="788FF453" wp14:editId="459D061E">
+          <wp:inline distT="114300" distB="114300" distL="114300" distR="114300" wp14:anchorId="7124CAB7" wp14:editId="2B81BDC0">
             <wp:extent cx="5943600" cy="2120900"/>
             <wp:effectExtent l="0" t="0" r="0" b="0"/>
             <wp:docPr id="3" name="image7.png"/>
@@ -2693,9 +2345,7 @@
     </w:p>
     <w:tbl>
       <w:tblPr>
-        <w:tblStyle w:val="a0"/>
         <w:tblW w:w="7720" w:type="dxa"/>
-        <w:tblInd w:w="0" w:type="dxa"/>
         <w:tblBorders>
           <w:top w:val="nil"/>
           <w:left w:val="nil"/>
@@ -2740,7 +2390,6 @@
                 <w:rFonts w:ascii="Roboto Mono" w:eastAsia="Roboto Mono" w:hAnsi="Roboto Mono"/>
                 <w:b/>
                 <w:bCs/>
-                <w:sz w:val="24"/>
               </w:rPr>
               <w:t>Clause</w:t>
             </w:r>
@@ -2771,7 +2420,6 @@
                 <w:rFonts w:ascii="Roboto Mono" w:eastAsia="Roboto Mono" w:hAnsi="Roboto Mono"/>
                 <w:b/>
                 <w:bCs/>
-                <w:sz w:val="24"/>
               </w:rPr>
               <w:t>Example</w:t>
             </w:r>
@@ -2803,7 +2451,6 @@
               <w:rPr>
                 <w:rFonts w:ascii="Roboto Mono" w:eastAsia="Roboto Mono" w:hAnsi="Roboto Mono" w:cs="Roboto Mono"/>
                 <w:color w:val="188038"/>
-                <w:sz w:val="24"/>
               </w:rPr>
               <w:t>WHERE</w:t>
             </w:r>
@@ -2829,7 +2476,6 @@
             <w:r>
               <w:rPr>
                 <w:rFonts w:ascii="Roboto Mono" w:eastAsia="Roboto Mono" w:hAnsi="Roboto Mono"/>
-                <w:sz w:val="24"/>
               </w:rPr>
               <w:t>Filter rows based on subquery result</w:t>
             </w:r>
@@ -2861,7 +2507,6 @@
               <w:rPr>
                 <w:rFonts w:ascii="Roboto Mono" w:eastAsia="Roboto Mono" w:hAnsi="Roboto Mono" w:cs="Roboto Mono"/>
                 <w:color w:val="188038"/>
-                <w:sz w:val="24"/>
               </w:rPr>
               <w:t>FROM</w:t>
             </w:r>
@@ -2887,7 +2532,6 @@
             <w:r>
               <w:rPr>
                 <w:rFonts w:ascii="Roboto Mono" w:eastAsia="Roboto Mono" w:hAnsi="Roboto Mono"/>
-                <w:sz w:val="24"/>
               </w:rPr>
               <w:t>Use a subquery as a temporary table (</w:t>
             </w:r>
@@ -2895,14 +2539,12 @@
               <w:rPr>
                 <w:rFonts w:ascii="Roboto Mono" w:eastAsia="Roboto Mono" w:hAnsi="Roboto Mono" w:cs="Roboto Mono"/>
                 <w:color w:val="188038"/>
-                <w:sz w:val="24"/>
               </w:rPr>
               <w:t>derived table</w:t>
             </w:r>
             <w:r>
               <w:rPr>
                 <w:rFonts w:ascii="Roboto Mono" w:eastAsia="Roboto Mono" w:hAnsi="Roboto Mono"/>
-                <w:sz w:val="24"/>
               </w:rPr>
               <w:t>)</w:t>
             </w:r>
@@ -2934,9 +2576,7 @@
               <w:rPr>
                 <w:rFonts w:ascii="Roboto Mono" w:eastAsia="Roboto Mono" w:hAnsi="Roboto Mono" w:cs="Roboto Mono"/>
                 <w:color w:val="188038"/>
-                <w:sz w:val="24"/>
               </w:rPr>
-              <w:lastRenderedPageBreak/>
               <w:t>SELECT</w:t>
             </w:r>
           </w:p>
@@ -2961,7 +2601,6 @@
             <w:r>
               <w:rPr>
                 <w:rFonts w:ascii="Roboto Mono" w:eastAsia="Roboto Mono" w:hAnsi="Roboto Mono"/>
-                <w:sz w:val="24"/>
               </w:rPr>
               <w:t>Return computed values</w:t>
             </w:r>
@@ -2993,7 +2632,6 @@
               <w:rPr>
                 <w:rFonts w:ascii="Roboto Mono" w:eastAsia="Roboto Mono" w:hAnsi="Roboto Mono" w:cs="Roboto Mono"/>
                 <w:color w:val="188038"/>
-                <w:sz w:val="24"/>
               </w:rPr>
               <w:t>HAVING</w:t>
             </w:r>
@@ -3019,7 +2657,6 @@
             <w:r>
               <w:rPr>
                 <w:rFonts w:ascii="Roboto Mono" w:eastAsia="Roboto Mono" w:hAnsi="Roboto Mono"/>
-                <w:sz w:val="24"/>
               </w:rPr>
               <w:t>Compare grouped results</w:t>
             </w:r>
@@ -3051,14 +2688,12 @@
               <w:rPr>
                 <w:rFonts w:ascii="Roboto Mono" w:eastAsia="Roboto Mono" w:hAnsi="Roboto Mono" w:cs="Roboto Mono"/>
                 <w:color w:val="188038"/>
-                <w:sz w:val="24"/>
               </w:rPr>
               <w:t>INSERT</w:t>
             </w:r>
             <w:r>
               <w:rPr>
                 <w:rFonts w:ascii="Roboto Mono" w:eastAsia="Roboto Mono" w:hAnsi="Roboto Mono"/>
-                <w:sz w:val="24"/>
               </w:rPr>
               <w:t xml:space="preserve">, </w:t>
             </w:r>
@@ -3066,14 +2701,12 @@
               <w:rPr>
                 <w:rFonts w:ascii="Roboto Mono" w:eastAsia="Roboto Mono" w:hAnsi="Roboto Mono" w:cs="Roboto Mono"/>
                 <w:color w:val="188038"/>
-                <w:sz w:val="24"/>
               </w:rPr>
               <w:t>UPDATE</w:t>
             </w:r>
             <w:r>
               <w:rPr>
                 <w:rFonts w:ascii="Roboto Mono" w:eastAsia="Roboto Mono" w:hAnsi="Roboto Mono"/>
-                <w:sz w:val="24"/>
               </w:rPr>
               <w:t xml:space="preserve">, </w:t>
             </w:r>
@@ -3081,7 +2714,6 @@
               <w:rPr>
                 <w:rFonts w:ascii="Roboto Mono" w:eastAsia="Roboto Mono" w:hAnsi="Roboto Mono" w:cs="Roboto Mono"/>
                 <w:color w:val="188038"/>
-                <w:sz w:val="24"/>
               </w:rPr>
               <w:t>DELETE</w:t>
             </w:r>
@@ -3107,7 +2739,6 @@
             <w:r>
               <w:rPr>
                 <w:rFonts w:ascii="Roboto Mono" w:eastAsia="Roboto Mono" w:hAnsi="Roboto Mono"/>
-                <w:sz w:val="24"/>
               </w:rPr>
               <w:t>Use subqueries to filter or insert related data</w:t>
             </w:r>
@@ -3119,9 +2750,8 @@
       <w:r>
         <w:rPr>
           <w:rFonts w:ascii="Roboto Mono" w:eastAsia="Roboto Mono" w:hAnsi="Roboto Mono"/>
-          <w:sz w:val="24"/>
-        </w:rPr>
-        <w:pict w14:anchorId="34009161">
+        </w:rPr>
+        <w:pict w14:anchorId="48005DA4">
           <v:rect id="_x0000_i1031" style="width:0;height:1.5pt" o:hralign="center" o:hrstd="t" o:hr="t" fillcolor="#a0a0a0" stroked="f"/>
         </w:pict>
       </w:r>
@@ -3172,25 +2802,7 @@
           <w:sz w:val="18"/>
           <w:highlight w:val="lightGray"/>
         </w:rPr>
-        <w:t xml:space="preserve">: Persons Table -&gt; ID Column: 1, </w:t>
-      </w:r>
-      <w:proofErr w:type="spellStart"/>
-      <w:r>
-        <w:rPr>
-          <w:color w:val="000000"/>
-          <w:sz w:val="18"/>
-          <w:highlight w:val="lightGray"/>
-        </w:rPr>
-        <w:t>Name_En</w:t>
-      </w:r>
-      <w:proofErr w:type="spellEnd"/>
-      <w:r>
-        <w:rPr>
-          <w:color w:val="000000"/>
-          <w:sz w:val="18"/>
-          <w:highlight w:val="lightGray"/>
-        </w:rPr>
-        <w:t xml:space="preserve"> Column: Motasem Essam] -&gt; </w:t>
+        <w:t xml:space="preserve">: Persons Table -&gt; ID Column: 1, Name_En Column: Motasem Essam] -&gt; </w:t>
       </w:r>
       <w:r>
         <w:rPr>
@@ -3233,37 +2845,34 @@
           <w:ilvl w:val="0"/>
           <w:numId w:val="6"/>
         </w:numPr>
+        <w:spacing w:before="240" w:after="240" w:line="276" w:lineRule="auto"/>
+      </w:pPr>
+      <w:r>
+        <w:rPr>
+          <w:rFonts w:ascii="Roboto Mono" w:eastAsia="Roboto Mono" w:hAnsi="Roboto Mono"/>
+          <w:b/>
+          <w:bCs/>
+        </w:rPr>
+        <w:t>Scalar subquery</w:t>
+      </w:r>
+      <w:r>
+        <w:rPr>
+          <w:rFonts w:ascii="Roboto Mono" w:eastAsia="Roboto Mono" w:hAnsi="Roboto Mono" w:cs="Arial Unicode MS"/>
+        </w:rPr>
+        <w:t xml:space="preserve"> → returns </w:t>
+      </w:r>
+      <w:r>
+        <w:rPr>
+          <w:rFonts w:ascii="Roboto Mono" w:eastAsia="Roboto Mono" w:hAnsi="Roboto Mono"/>
+          <w:b/>
+          <w:bCs/>
+        </w:rPr>
+        <w:t>single value</w:t>
+      </w:r>
+    </w:p>
+    <w:p>
+      <w:pPr>
         <w:spacing w:before="240" w:after="240"/>
-      </w:pPr>
-      <w:r>
-        <w:rPr>
-          <w:rFonts w:ascii="Roboto Mono" w:eastAsia="Roboto Mono" w:hAnsi="Roboto Mono"/>
-          <w:b/>
-          <w:bCs/>
-          <w:sz w:val="24"/>
-        </w:rPr>
-        <w:t>Scalar subquery</w:t>
-      </w:r>
-      <w:r>
-        <w:rPr>
-          <w:rFonts w:ascii="Roboto Mono" w:eastAsia="Roboto Mono" w:hAnsi="Roboto Mono" w:cs="Arial Unicode MS"/>
-          <w:sz w:val="24"/>
-        </w:rPr>
-        <w:t xml:space="preserve"> → returns </w:t>
-      </w:r>
-      <w:r>
-        <w:rPr>
-          <w:rFonts w:ascii="Roboto Mono" w:eastAsia="Roboto Mono" w:hAnsi="Roboto Mono"/>
-          <w:b/>
-          <w:bCs/>
-          <w:sz w:val="24"/>
-        </w:rPr>
-        <w:t>single value</w:t>
-      </w:r>
-    </w:p>
-    <w:p>
-      <w:pPr>
-        <w:spacing w:before="240" w:after="240"/>
         <w:rPr>
           <w:b/>
           <w:bCs/>
@@ -3276,7 +2885,7 @@
           <w:noProof/>
         </w:rPr>
         <w:drawing>
-          <wp:inline distT="114300" distB="114300" distL="114300" distR="114300" wp14:anchorId="14D5FFF8" wp14:editId="70C99CBD">
+          <wp:inline distT="114300" distB="114300" distL="114300" distR="114300" wp14:anchorId="2B593E8D" wp14:editId="19C16BDC">
             <wp:extent cx="5943600" cy="1117600"/>
             <wp:effectExtent l="0" t="0" r="0" b="0"/>
             <wp:docPr id="4" name="image2.png"/>
@@ -3316,7 +2925,6 @@
       <w:r>
         <w:rPr>
           <w:rFonts w:ascii="Roboto Mono" w:eastAsia="Roboto Mono" w:hAnsi="Roboto Mono"/>
-          <w:sz w:val="24"/>
         </w:rPr>
         <w:t>SELECT ProductName,</w:t>
       </w:r>
@@ -3325,41 +2933,14 @@
       <w:r>
         <w:rPr>
           <w:rFonts w:ascii="Roboto Mono" w:eastAsia="Roboto Mono" w:hAnsi="Roboto Mono"/>
-          <w:sz w:val="24"/>
-        </w:rPr>
-        <w:t xml:space="preserve">       (SELECT AVG(</w:t>
-      </w:r>
-      <w:proofErr w:type="spellStart"/>
-      <w:r>
-        <w:rPr>
-          <w:rFonts w:ascii="Roboto Mono" w:eastAsia="Roboto Mono" w:hAnsi="Roboto Mono"/>
-          <w:sz w:val="24"/>
-        </w:rPr>
-        <w:t>UnitPrice</w:t>
-      </w:r>
-      <w:proofErr w:type="spellEnd"/>
-      <w:r>
-        <w:rPr>
-          <w:rFonts w:ascii="Roboto Mono" w:eastAsia="Roboto Mono" w:hAnsi="Roboto Mono"/>
-          <w:sz w:val="24"/>
-        </w:rPr>
-        <w:t xml:space="preserve">) FROM Products) AS </w:t>
-      </w:r>
-      <w:proofErr w:type="spellStart"/>
-      <w:r>
-        <w:rPr>
-          <w:rFonts w:ascii="Roboto Mono" w:eastAsia="Roboto Mono" w:hAnsi="Roboto Mono"/>
-          <w:sz w:val="24"/>
-        </w:rPr>
-        <w:t>AvgPrice</w:t>
-      </w:r>
-      <w:proofErr w:type="spellEnd"/>
-    </w:p>
-    <w:p>
-      <w:r>
-        <w:rPr>
-          <w:rFonts w:ascii="Roboto Mono" w:eastAsia="Roboto Mono" w:hAnsi="Roboto Mono"/>
-          <w:sz w:val="24"/>
+        </w:rPr>
+        <w:t xml:space="preserve">       (SELECT AVG(UnitPrice) FROM Products) AS AvgPrice</w:t>
+      </w:r>
+    </w:p>
+    <w:p>
+      <w:r>
+        <w:rPr>
+          <w:rFonts w:ascii="Roboto Mono" w:eastAsia="Roboto Mono" w:hAnsi="Roboto Mono"/>
         </w:rPr>
         <w:t>FROM Products;</w:t>
       </w:r>
@@ -3371,37 +2952,34 @@
           <w:ilvl w:val="0"/>
           <w:numId w:val="4"/>
         </w:numPr>
+        <w:spacing w:before="240" w:after="240" w:line="276" w:lineRule="auto"/>
+      </w:pPr>
+      <w:r>
+        <w:rPr>
+          <w:rFonts w:ascii="Roboto Mono" w:eastAsia="Roboto Mono" w:hAnsi="Roboto Mono"/>
+          <w:b/>
+          <w:bCs/>
+        </w:rPr>
+        <w:t>Column subquery</w:t>
+      </w:r>
+      <w:r>
+        <w:rPr>
+          <w:rFonts w:ascii="Roboto Mono" w:eastAsia="Roboto Mono" w:hAnsi="Roboto Mono" w:cs="Arial Unicode MS"/>
+        </w:rPr>
+        <w:t xml:space="preserve"> → returns </w:t>
+      </w:r>
+      <w:r>
+        <w:rPr>
+          <w:rFonts w:ascii="Roboto Mono" w:eastAsia="Roboto Mono" w:hAnsi="Roboto Mono"/>
+          <w:b/>
+          <w:bCs/>
+        </w:rPr>
+        <w:t>one column, many rows</w:t>
+      </w:r>
+    </w:p>
+    <w:p>
+      <w:pPr>
         <w:spacing w:before="240" w:after="240"/>
-      </w:pPr>
-      <w:r>
-        <w:rPr>
-          <w:rFonts w:ascii="Roboto Mono" w:eastAsia="Roboto Mono" w:hAnsi="Roboto Mono"/>
-          <w:b/>
-          <w:bCs/>
-          <w:sz w:val="24"/>
-        </w:rPr>
-        <w:t>Column subquery</w:t>
-      </w:r>
-      <w:r>
-        <w:rPr>
-          <w:rFonts w:ascii="Roboto Mono" w:eastAsia="Roboto Mono" w:hAnsi="Roboto Mono" w:cs="Arial Unicode MS"/>
-          <w:sz w:val="24"/>
-        </w:rPr>
-        <w:t xml:space="preserve"> → returns </w:t>
-      </w:r>
-      <w:r>
-        <w:rPr>
-          <w:rFonts w:ascii="Roboto Mono" w:eastAsia="Roboto Mono" w:hAnsi="Roboto Mono"/>
-          <w:b/>
-          <w:bCs/>
-          <w:sz w:val="24"/>
-        </w:rPr>
-        <w:t>one column, many rows</w:t>
-      </w:r>
-    </w:p>
-    <w:p>
-      <w:pPr>
-        <w:spacing w:before="240" w:after="240"/>
         <w:rPr>
           <w:b/>
           <w:bCs/>
@@ -3414,7 +2992,7 @@
           <w:noProof/>
         </w:rPr>
         <w:drawing>
-          <wp:inline distT="114300" distB="114300" distL="114300" distR="114300" wp14:anchorId="018F0217" wp14:editId="664FD08B">
+          <wp:inline distT="114300" distB="114300" distL="114300" distR="114300" wp14:anchorId="2C539916" wp14:editId="1E24A362">
             <wp:extent cx="5943600" cy="1346200"/>
             <wp:effectExtent l="0" t="0" r="0" b="0"/>
             <wp:docPr id="7" name="image8.png"/>
@@ -3461,25 +3039,14 @@
       <w:r>
         <w:rPr>
           <w:rFonts w:ascii="Roboto Mono" w:eastAsia="Roboto Mono" w:hAnsi="Roboto Mono"/>
-          <w:sz w:val="24"/>
-        </w:rPr>
-        <w:t xml:space="preserve">SELECT </w:t>
-      </w:r>
-      <w:proofErr w:type="spellStart"/>
-      <w:r>
-        <w:rPr>
-          <w:rFonts w:ascii="Roboto Mono" w:eastAsia="Roboto Mono" w:hAnsi="Roboto Mono"/>
-          <w:sz w:val="24"/>
-        </w:rPr>
-        <w:t>CustomerName</w:t>
-      </w:r>
-      <w:proofErr w:type="spellEnd"/>
-    </w:p>
-    <w:p>
-      <w:r>
-        <w:rPr>
-          <w:rFonts w:ascii="Roboto Mono" w:eastAsia="Roboto Mono" w:hAnsi="Roboto Mono"/>
-          <w:sz w:val="24"/>
+        </w:rPr>
+        <w:t>SELECT CustomerName</w:t>
+      </w:r>
+    </w:p>
+    <w:p>
+      <w:r>
+        <w:rPr>
+          <w:rFonts w:ascii="Roboto Mono" w:eastAsia="Roboto Mono" w:hAnsi="Roboto Mono"/>
         </w:rPr>
         <w:t>FROM Customers</w:t>
       </w:r>
@@ -3488,58 +3055,22 @@
       <w:r>
         <w:rPr>
           <w:rFonts w:ascii="Roboto Mono" w:eastAsia="Roboto Mono" w:hAnsi="Roboto Mono"/>
-          <w:sz w:val="24"/>
-        </w:rPr>
-        <w:t xml:space="preserve">WHERE </w:t>
-      </w:r>
-      <w:proofErr w:type="spellStart"/>
-      <w:r>
-        <w:rPr>
-          <w:rFonts w:ascii="Roboto Mono" w:eastAsia="Roboto Mono" w:hAnsi="Roboto Mono"/>
-          <w:sz w:val="24"/>
-        </w:rPr>
-        <w:t>CustomerID</w:t>
-      </w:r>
-      <w:proofErr w:type="spellEnd"/>
-      <w:r>
-        <w:rPr>
-          <w:rFonts w:ascii="Roboto Mono" w:eastAsia="Roboto Mono" w:hAnsi="Roboto Mono"/>
-          <w:sz w:val="24"/>
-        </w:rPr>
-        <w:t xml:space="preserve"> IN (</w:t>
-      </w:r>
-    </w:p>
-    <w:p>
-      <w:r>
-        <w:rPr>
-          <w:rFonts w:ascii="Roboto Mono" w:eastAsia="Roboto Mono" w:hAnsi="Roboto Mono"/>
-          <w:sz w:val="24"/>
-        </w:rPr>
-        <w:lastRenderedPageBreak/>
-        <w:t xml:space="preserve">    SELECT </w:t>
-      </w:r>
-      <w:proofErr w:type="spellStart"/>
-      <w:r>
-        <w:rPr>
-          <w:rFonts w:ascii="Roboto Mono" w:eastAsia="Roboto Mono" w:hAnsi="Roboto Mono"/>
-          <w:sz w:val="24"/>
-        </w:rPr>
-        <w:t>CustomerID</w:t>
-      </w:r>
-      <w:proofErr w:type="spellEnd"/>
-      <w:r>
-        <w:rPr>
-          <w:rFonts w:ascii="Roboto Mono" w:eastAsia="Roboto Mono" w:hAnsi="Roboto Mono"/>
-          <w:sz w:val="24"/>
-        </w:rPr>
-        <w:t xml:space="preserve"> FROM Orders</w:t>
-      </w:r>
-    </w:p>
-    <w:p>
-      <w:r>
-        <w:rPr>
-          <w:rFonts w:ascii="Roboto Mono" w:eastAsia="Roboto Mono" w:hAnsi="Roboto Mono"/>
-          <w:sz w:val="24"/>
+        </w:rPr>
+        <w:t>WHERE CustomerID IN (</w:t>
+      </w:r>
+    </w:p>
+    <w:p>
+      <w:r>
+        <w:rPr>
+          <w:rFonts w:ascii="Roboto Mono" w:eastAsia="Roboto Mono" w:hAnsi="Roboto Mono"/>
+        </w:rPr>
+        <w:t xml:space="preserve">    SELECT CustomerID FROM Orders</w:t>
+      </w:r>
+    </w:p>
+    <w:p>
+      <w:r>
+        <w:rPr>
+          <w:rFonts w:ascii="Roboto Mono" w:eastAsia="Roboto Mono" w:hAnsi="Roboto Mono"/>
         </w:rPr>
         <w:t>);</w:t>
       </w:r>
@@ -3551,33 +3082,39 @@
           <w:ilvl w:val="0"/>
           <w:numId w:val="1"/>
         </w:numPr>
+        <w:spacing w:before="240" w:after="240" w:line="276" w:lineRule="auto"/>
+      </w:pPr>
+      <w:r>
+        <w:rPr>
+          <w:rFonts w:ascii="Roboto Mono" w:eastAsia="Roboto Mono" w:hAnsi="Roboto Mono"/>
+          <w:b/>
+          <w:bCs/>
+        </w:rPr>
+        <w:t>Row subquery</w:t>
+      </w:r>
+      <w:r>
+        <w:rPr>
+          <w:rFonts w:ascii="Roboto Mono" w:eastAsia="Roboto Mono" w:hAnsi="Roboto Mono" w:cs="Arial Unicode MS"/>
+        </w:rPr>
+        <w:t xml:space="preserve"> → returns </w:t>
+      </w:r>
+      <w:r>
+        <w:rPr>
+          <w:rFonts w:ascii="Roboto Mono" w:eastAsia="Roboto Mono" w:hAnsi="Roboto Mono"/>
+          <w:b/>
+          <w:bCs/>
+        </w:rPr>
+        <w:t>one full row</w:t>
+      </w:r>
+    </w:p>
+    <w:p>
+      <w:pPr>
         <w:spacing w:before="240" w:after="240"/>
-      </w:pPr>
-      <w:r>
-        <w:rPr>
-          <w:rFonts w:ascii="Roboto Mono" w:eastAsia="Roboto Mono" w:hAnsi="Roboto Mono"/>
-          <w:b/>
-          <w:bCs/>
-          <w:sz w:val="24"/>
-        </w:rPr>
-        <w:t>Row subquery</w:t>
-      </w:r>
-      <w:r>
-        <w:rPr>
-          <w:rFonts w:ascii="Roboto Mono" w:eastAsia="Roboto Mono" w:hAnsi="Roboto Mono" w:cs="Arial Unicode MS"/>
-          <w:sz w:val="24"/>
-        </w:rPr>
-        <w:t xml:space="preserve"> → returns </w:t>
-      </w:r>
-      <w:r>
-        <w:rPr>
-          <w:rFonts w:ascii="Roboto Mono" w:eastAsia="Roboto Mono" w:hAnsi="Roboto Mono"/>
-          <w:b/>
-          <w:bCs/>
-          <w:sz w:val="24"/>
-        </w:rPr>
-        <w:t>one full row</w:t>
-      </w:r>
+        <w:rPr>
+          <w:b/>
+          <w:bCs/>
+        </w:rPr>
+      </w:pPr>
     </w:p>
     <w:p>
       <w:pPr>
@@ -3587,15 +3124,6 @@
           <w:bCs/>
         </w:rPr>
       </w:pPr>
-    </w:p>
-    <w:p>
-      <w:pPr>
-        <w:spacing w:before="240" w:after="240"/>
-        <w:rPr>
-          <w:b/>
-          <w:bCs/>
-        </w:rPr>
-      </w:pPr>
       <w:r>
         <w:rPr>
           <w:b/>
@@ -3603,7 +3131,7 @@
           <w:noProof/>
         </w:rPr>
         <w:drawing>
-          <wp:inline distT="114300" distB="114300" distL="114300" distR="114300" wp14:anchorId="1F005A70" wp14:editId="6B9A35E1">
+          <wp:inline distT="114300" distB="114300" distL="114300" distR="114300" wp14:anchorId="7E9C9787" wp14:editId="586E0755">
             <wp:extent cx="5943600" cy="1422400"/>
             <wp:effectExtent l="0" t="0" r="0" b="0"/>
             <wp:docPr id="9" name="image3.png"/>
@@ -3643,7 +3171,6 @@
       <w:r>
         <w:rPr>
           <w:rFonts w:ascii="Roboto Mono" w:eastAsia="Roboto Mono" w:hAnsi="Roboto Mono"/>
-          <w:sz w:val="24"/>
         </w:rPr>
         <w:t>SELECT *</w:t>
       </w:r>
@@ -3652,7 +3179,6 @@
       <w:r>
         <w:rPr>
           <w:rFonts w:ascii="Roboto Mono" w:eastAsia="Roboto Mono" w:hAnsi="Roboto Mono"/>
-          <w:sz w:val="24"/>
         </w:rPr>
         <w:t>FROM Employees</w:t>
       </w:r>
@@ -3661,7 +3187,6 @@
       <w:r>
         <w:rPr>
           <w:rFonts w:ascii="Roboto Mono" w:eastAsia="Roboto Mono" w:hAnsi="Roboto Mono"/>
-          <w:sz w:val="24"/>
         </w:rPr>
         <w:t>WHERE (FirstName, LastName) = (</w:t>
       </w:r>
@@ -3670,32 +3195,14 @@
       <w:r>
         <w:rPr>
           <w:rFonts w:ascii="Roboto Mono" w:eastAsia="Roboto Mono" w:hAnsi="Roboto Mono"/>
-          <w:sz w:val="24"/>
-        </w:rPr>
-        <w:t xml:space="preserve">    SELECT FirstName, LastName FROM Managers WHERE </w:t>
-      </w:r>
-      <w:proofErr w:type="spellStart"/>
-      <w:r>
-        <w:rPr>
-          <w:rFonts w:ascii="Roboto Mono" w:eastAsia="Roboto Mono" w:hAnsi="Roboto Mono"/>
-          <w:sz w:val="24"/>
-        </w:rPr>
-        <w:t>ManagerID</w:t>
-      </w:r>
-      <w:proofErr w:type="spellEnd"/>
-      <w:r>
-        <w:rPr>
-          <w:rFonts w:ascii="Roboto Mono" w:eastAsia="Roboto Mono" w:hAnsi="Roboto Mono"/>
-          <w:sz w:val="24"/>
-        </w:rPr>
-        <w:t xml:space="preserve"> = 1</w:t>
-      </w:r>
-    </w:p>
-    <w:p>
-      <w:r>
-        <w:rPr>
-          <w:rFonts w:ascii="Roboto Mono" w:eastAsia="Roboto Mono" w:hAnsi="Roboto Mono"/>
-          <w:sz w:val="24"/>
+        </w:rPr>
+        <w:t xml:space="preserve">    SELECT FirstName, LastName FROM Managers WHERE ManagerID = 1</w:t>
+      </w:r>
+    </w:p>
+    <w:p>
+      <w:r>
+        <w:rPr>
+          <w:rFonts w:ascii="Roboto Mono" w:eastAsia="Roboto Mono" w:hAnsi="Roboto Mono"/>
         </w:rPr>
         <w:t>);</w:t>
       </w:r>
@@ -3707,35 +3214,33 @@
           <w:ilvl w:val="0"/>
           <w:numId w:val="3"/>
         </w:numPr>
+        <w:spacing w:before="240" w:after="240" w:line="276" w:lineRule="auto"/>
+      </w:pPr>
+      <w:r>
+        <w:rPr>
+          <w:rFonts w:ascii="Roboto Mono" w:eastAsia="Roboto Mono" w:hAnsi="Roboto Mono"/>
+          <w:b/>
+          <w:bCs/>
+        </w:rPr>
+        <w:t>Correlated subquery</w:t>
+      </w:r>
+      <w:r>
+        <w:rPr>
+          <w:rFonts w:ascii="Roboto Mono" w:eastAsia="Roboto Mono" w:hAnsi="Roboto Mono" w:cs="Arial Unicode MS"/>
+        </w:rPr>
+        <w:t xml:space="preserve"> → references the outer query</w:t>
+      </w:r>
+    </w:p>
+    <w:p>
+      <w:pPr>
         <w:spacing w:before="240" w:after="240"/>
       </w:pPr>
       <w:r>
         <w:rPr>
-          <w:rFonts w:ascii="Roboto Mono" w:eastAsia="Roboto Mono" w:hAnsi="Roboto Mono"/>
-          <w:b/>
-          <w:bCs/>
-          <w:sz w:val="24"/>
-        </w:rPr>
-        <w:t>Correlated subquery</w:t>
-      </w:r>
-      <w:r>
-        <w:rPr>
-          <w:rFonts w:ascii="Roboto Mono" w:eastAsia="Roboto Mono" w:hAnsi="Roboto Mono" w:cs="Arial Unicode MS"/>
-          <w:sz w:val="24"/>
-        </w:rPr>
-        <w:t xml:space="preserve"> → references the outer query</w:t>
-      </w:r>
-    </w:p>
-    <w:p>
-      <w:pPr>
-        <w:spacing w:before="240" w:after="240"/>
-      </w:pPr>
-      <w:r>
-        <w:rPr>
           <w:noProof/>
         </w:rPr>
         <w:drawing>
-          <wp:inline distT="114300" distB="114300" distL="114300" distR="114300" wp14:anchorId="1611E59D" wp14:editId="47A268AA">
+          <wp:inline distT="114300" distB="114300" distL="114300" distR="114300" wp14:anchorId="101C3A4C" wp14:editId="25F53719">
             <wp:extent cx="5943600" cy="1574800"/>
             <wp:effectExtent l="0" t="0" r="0" b="0"/>
             <wp:docPr id="6" name="image5.png"/>
@@ -3775,25 +3280,14 @@
       <w:r>
         <w:rPr>
           <w:rFonts w:ascii="Roboto Mono" w:eastAsia="Roboto Mono" w:hAnsi="Roboto Mono"/>
-          <w:sz w:val="24"/>
-        </w:rPr>
-        <w:t xml:space="preserve">SELECT </w:t>
-      </w:r>
-      <w:proofErr w:type="spellStart"/>
-      <w:r>
-        <w:rPr>
-          <w:rFonts w:ascii="Roboto Mono" w:eastAsia="Roboto Mono" w:hAnsi="Roboto Mono"/>
-          <w:sz w:val="24"/>
-        </w:rPr>
-        <w:t>CustomerName</w:t>
-      </w:r>
-      <w:proofErr w:type="spellEnd"/>
-    </w:p>
-    <w:p>
-      <w:r>
-        <w:rPr>
-          <w:rFonts w:ascii="Roboto Mono" w:eastAsia="Roboto Mono" w:hAnsi="Roboto Mono"/>
-          <w:sz w:val="24"/>
+        </w:rPr>
+        <w:t>SELECT CustomerName</w:t>
+      </w:r>
+    </w:p>
+    <w:p>
+      <w:r>
+        <w:rPr>
+          <w:rFonts w:ascii="Roboto Mono" w:eastAsia="Roboto Mono" w:hAnsi="Roboto Mono"/>
         </w:rPr>
         <w:t>FROM Customers c</w:t>
       </w:r>
@@ -3802,7 +3296,6 @@
       <w:r>
         <w:rPr>
           <w:rFonts w:ascii="Roboto Mono" w:eastAsia="Roboto Mono" w:hAnsi="Roboto Mono"/>
-          <w:sz w:val="24"/>
         </w:rPr>
         <w:t>WHERE EXISTS (</w:t>
       </w:r>
@@ -3811,7 +3304,6 @@
       <w:r>
         <w:rPr>
           <w:rFonts w:ascii="Roboto Mono" w:eastAsia="Roboto Mono" w:hAnsi="Roboto Mono"/>
-          <w:sz w:val="24"/>
         </w:rPr>
         <w:t xml:space="preserve">    SELECT 1 FROM Orders o</w:t>
       </w:r>
@@ -3820,41 +3312,14 @@
       <w:r>
         <w:rPr>
           <w:rFonts w:ascii="Roboto Mono" w:eastAsia="Roboto Mono" w:hAnsi="Roboto Mono"/>
-          <w:sz w:val="24"/>
-        </w:rPr>
-        <w:t xml:space="preserve">    WHERE </w:t>
-      </w:r>
-      <w:proofErr w:type="spellStart"/>
-      <w:r>
-        <w:rPr>
-          <w:rFonts w:ascii="Roboto Mono" w:eastAsia="Roboto Mono" w:hAnsi="Roboto Mono"/>
-          <w:sz w:val="24"/>
-        </w:rPr>
-        <w:t>o.CustomerID</w:t>
-      </w:r>
-      <w:proofErr w:type="spellEnd"/>
-      <w:r>
-        <w:rPr>
-          <w:rFonts w:ascii="Roboto Mono" w:eastAsia="Roboto Mono" w:hAnsi="Roboto Mono"/>
-          <w:sz w:val="24"/>
-        </w:rPr>
-        <w:t xml:space="preserve"> = </w:t>
-      </w:r>
-      <w:proofErr w:type="spellStart"/>
-      <w:r>
-        <w:rPr>
-          <w:rFonts w:ascii="Roboto Mono" w:eastAsia="Roboto Mono" w:hAnsi="Roboto Mono"/>
-          <w:sz w:val="24"/>
-        </w:rPr>
-        <w:t>c.CustomerID</w:t>
-      </w:r>
-      <w:proofErr w:type="spellEnd"/>
-    </w:p>
-    <w:p>
-      <w:r>
-        <w:rPr>
-          <w:rFonts w:ascii="Roboto Mono" w:eastAsia="Roboto Mono" w:hAnsi="Roboto Mono"/>
-          <w:sz w:val="24"/>
+        </w:rPr>
+        <w:t xml:space="preserve">    WHERE o.CustomerID = c.CustomerID</w:t>
+      </w:r>
+    </w:p>
+    <w:p>
+      <w:r>
+        <w:rPr>
+          <w:rFonts w:ascii="Roboto Mono" w:eastAsia="Roboto Mono" w:hAnsi="Roboto Mono"/>
         </w:rPr>
         <w:t>);</w:t>
       </w:r>
@@ -3864,9 +3329,8 @@
       <w:r>
         <w:rPr>
           <w:rFonts w:ascii="Roboto Mono" w:eastAsia="Roboto Mono" w:hAnsi="Roboto Mono"/>
-          <w:sz w:val="24"/>
-        </w:rPr>
-        <w:pict w14:anchorId="3C96172D">
+        </w:rPr>
+        <w:pict w14:anchorId="51152B2D">
           <v:rect id="_x0000_i1032" style="width:0;height:1.5pt" o:hralign="center" o:hrstd="t" o:hr="t" fillcolor="#a0a0a0" stroked="f"/>
         </w:pict>
       </w:r>
@@ -3917,25 +3381,7 @@
           <w:sz w:val="18"/>
           <w:highlight w:val="lightGray"/>
         </w:rPr>
-        <w:t xml:space="preserve">: Persons Table -&gt; ID Column: 1, </w:t>
-      </w:r>
-      <w:proofErr w:type="spellStart"/>
-      <w:r>
-        <w:rPr>
-          <w:color w:val="000000"/>
-          <w:sz w:val="18"/>
-          <w:highlight w:val="lightGray"/>
-        </w:rPr>
-        <w:t>Name_En</w:t>
-      </w:r>
-      <w:proofErr w:type="spellEnd"/>
-      <w:r>
-        <w:rPr>
-          <w:color w:val="000000"/>
-          <w:sz w:val="18"/>
-          <w:highlight w:val="lightGray"/>
-        </w:rPr>
-        <w:t xml:space="preserve"> Column: Motasem Essam] -&gt; </w:t>
+        <w:t xml:space="preserve">: Persons Table -&gt; ID Column: 1, Name_En Column: Motasem Essam] -&gt; </w:t>
       </w:r>
       <w:r>
         <w:rPr>
@@ -3978,12 +3424,11 @@
           <w:ilvl w:val="0"/>
           <w:numId w:val="2"/>
         </w:numPr>
-        <w:spacing w:before="240"/>
-      </w:pPr>
-      <w:r>
-        <w:rPr>
-          <w:rFonts w:ascii="Roboto Mono" w:eastAsia="Roboto Mono" w:hAnsi="Roboto Mono"/>
-          <w:sz w:val="24"/>
+        <w:spacing w:before="240" w:after="0" w:line="276" w:lineRule="auto"/>
+      </w:pPr>
+      <w:r>
+        <w:rPr>
+          <w:rFonts w:ascii="Roboto Mono" w:eastAsia="Roboto Mono" w:hAnsi="Roboto Mono"/>
         </w:rPr>
         <w:t xml:space="preserve">Use </w:t>
       </w:r>
@@ -3992,21 +3437,18 @@
           <w:rFonts w:ascii="Roboto Mono" w:eastAsia="Roboto Mono" w:hAnsi="Roboto Mono"/>
           <w:b/>
           <w:bCs/>
-          <w:sz w:val="24"/>
         </w:rPr>
         <w:t>JOIN</w:t>
       </w:r>
       <w:r>
         <w:rPr>
           <w:rFonts w:ascii="Roboto Mono" w:eastAsia="Roboto Mono" w:hAnsi="Roboto Mono"/>
-          <w:sz w:val="24"/>
         </w:rPr>
         <w:t xml:space="preserve"> when you want to combine data.</w:t>
       </w:r>
       <w:r>
         <w:rPr>
           <w:rFonts w:ascii="Roboto Mono" w:eastAsia="Roboto Mono" w:hAnsi="Roboto Mono"/>
-          <w:sz w:val="24"/>
         </w:rPr>
         <w:br/>
       </w:r>
@@ -4017,12 +3459,11 @@
           <w:ilvl w:val="0"/>
           <w:numId w:val="2"/>
         </w:numPr>
-        <w:spacing w:after="240"/>
-      </w:pPr>
-      <w:r>
-        <w:rPr>
-          <w:rFonts w:ascii="Roboto Mono" w:eastAsia="Roboto Mono" w:hAnsi="Roboto Mono"/>
-          <w:sz w:val="24"/>
+        <w:spacing w:after="240" w:line="276" w:lineRule="auto"/>
+      </w:pPr>
+      <w:r>
+        <w:rPr>
+          <w:rFonts w:ascii="Roboto Mono" w:eastAsia="Roboto Mono" w:hAnsi="Roboto Mono"/>
         </w:rPr>
         <w:t xml:space="preserve">Use </w:t>
       </w:r>
@@ -4031,14 +3472,12 @@
           <w:rFonts w:ascii="Roboto Mono" w:eastAsia="Roboto Mono" w:hAnsi="Roboto Mono"/>
           <w:b/>
           <w:bCs/>
-          <w:sz w:val="24"/>
         </w:rPr>
         <w:t>subquery</w:t>
       </w:r>
       <w:r>
         <w:rPr>
           <w:rFonts w:ascii="Roboto Mono" w:eastAsia="Roboto Mono" w:hAnsi="Roboto Mono"/>
-          <w:sz w:val="24"/>
         </w:rPr>
         <w:t xml:space="preserve"> when you want to </w:t>
       </w:r>
@@ -4047,32 +3486,30 @@
           <w:rFonts w:ascii="Roboto Mono" w:eastAsia="Roboto Mono" w:hAnsi="Roboto Mono"/>
           <w:b/>
           <w:bCs/>
-          <w:sz w:val="24"/>
         </w:rPr>
         <w:t>filter</w:t>
       </w:r>
       <w:r>
         <w:rPr>
           <w:rFonts w:ascii="Roboto Mono" w:eastAsia="Roboto Mono" w:hAnsi="Roboto Mono"/>
-          <w:sz w:val="24"/>
         </w:rPr>
         <w:t xml:space="preserve"> or compute values based on another table.</w:t>
       </w:r>
       <w:r>
         <w:rPr>
           <w:rFonts w:ascii="Roboto Mono" w:eastAsia="Roboto Mono" w:hAnsi="Roboto Mono"/>
-          <w:sz w:val="24"/>
         </w:rPr>
         <w:br/>
       </w:r>
     </w:p>
+    <w:p/>
     <w:p/>
     <w:p/>
     <w:sectPr>
       <w:pgSz w:w="12240" w:h="15840"/>
       <w:pgMar w:top="1440" w:right="1440" w:bottom="1440" w:left="1440" w:header="720" w:footer="720" w:gutter="0"/>
-      <w:pgNumType w:start="1"/>
       <w:cols w:space="720"/>
+      <w:docGrid w:linePitch="360"/>
     </w:sectPr>
   </w:body>
 </w:document>
@@ -4900,15 +4337,17 @@
   <w:docDefaults>
     <w:rPrDefault>
       <w:rPr>
-        <w:rFonts w:ascii="Arial" w:eastAsia="Arial" w:hAnsi="Arial" w:cs="Arial"/>
-        <w:sz w:val="22"/>
-        <w:szCs w:val="22"/>
-        <w:lang w:val="en" w:eastAsia="en-US" w:bidi="ar-SA"/>
+        <w:rFonts w:asciiTheme="minorHAnsi" w:eastAsiaTheme="minorHAnsi" w:hAnsiTheme="minorHAnsi" w:cstheme="minorBidi"/>
+        <w:kern w:val="2"/>
+        <w:sz w:val="24"/>
+        <w:szCs w:val="24"/>
+        <w:lang w:val="en-US" w:eastAsia="en-US" w:bidi="ar-SA"/>
+        <w14:ligatures w14:val="standardContextual"/>
       </w:rPr>
     </w:rPrDefault>
     <w:pPrDefault>
       <w:pPr>
-        <w:spacing w:line="276" w:lineRule="auto"/>
+        <w:spacing w:after="160" w:line="278" w:lineRule="auto"/>
       </w:pPr>
     </w:pPrDefault>
   </w:docDefaults>
@@ -5298,15 +4737,19 @@
     <w:name w:val="heading 1"/>
     <w:basedOn w:val="Normal"/>
     <w:next w:val="Normal"/>
+    <w:link w:val="Heading1Char"/>
     <w:uiPriority w:val="9"/>
     <w:qFormat/>
+    <w:rsid w:val="008B03BE"/>
     <w:pPr>
       <w:keepNext/>
       <w:keepLines/>
-      <w:spacing w:before="400" w:after="120"/>
+      <w:spacing w:before="360" w:after="80"/>
       <w:outlineLvl w:val="0"/>
     </w:pPr>
     <w:rPr>
+      <w:rFonts w:asciiTheme="majorHAnsi" w:eastAsiaTheme="majorEastAsia" w:hAnsiTheme="majorHAnsi" w:cstheme="majorBidi"/>
+      <w:color w:val="2F5496" w:themeColor="accent1" w:themeShade="BF"/>
       <w:sz w:val="40"/>
       <w:szCs w:val="40"/>
     </w:rPr>
@@ -5315,16 +4758,20 @@
     <w:name w:val="heading 2"/>
     <w:basedOn w:val="Normal"/>
     <w:next w:val="Normal"/>
+    <w:link w:val="Heading2Char"/>
     <w:uiPriority w:val="9"/>
     <w:unhideWhenUsed/>
     <w:qFormat/>
+    <w:rsid w:val="008B03BE"/>
     <w:pPr>
       <w:keepNext/>
       <w:keepLines/>
-      <w:spacing w:before="360" w:after="120"/>
+      <w:spacing w:before="160" w:after="80"/>
       <w:outlineLvl w:val="1"/>
     </w:pPr>
     <w:rPr>
+      <w:rFonts w:asciiTheme="majorHAnsi" w:eastAsiaTheme="majorEastAsia" w:hAnsiTheme="majorHAnsi" w:cstheme="majorBidi"/>
+      <w:color w:val="2F5496" w:themeColor="accent1" w:themeShade="BF"/>
       <w:sz w:val="32"/>
       <w:szCs w:val="32"/>
     </w:rPr>
@@ -5333,17 +4780,20 @@
     <w:name w:val="heading 3"/>
     <w:basedOn w:val="Normal"/>
     <w:next w:val="Normal"/>
+    <w:link w:val="Heading3Char"/>
     <w:uiPriority w:val="9"/>
     <w:unhideWhenUsed/>
     <w:qFormat/>
+    <w:rsid w:val="008B03BE"/>
     <w:pPr>
       <w:keepNext/>
       <w:keepLines/>
-      <w:spacing w:before="320" w:after="80"/>
+      <w:spacing w:before="160" w:after="80"/>
       <w:outlineLvl w:val="2"/>
     </w:pPr>
     <w:rPr>
-      <w:color w:val="434343"/>
+      <w:rFonts w:eastAsiaTheme="majorEastAsia" w:cstheme="majorBidi"/>
+      <w:color w:val="2F5496" w:themeColor="accent1" w:themeShade="BF"/>
       <w:sz w:val="28"/>
       <w:szCs w:val="28"/>
     </w:rPr>
@@ -5352,58 +4802,132 @@
     <w:name w:val="heading 4"/>
     <w:basedOn w:val="Normal"/>
     <w:next w:val="Normal"/>
+    <w:link w:val="Heading4Char"/>
     <w:uiPriority w:val="9"/>
     <w:semiHidden/>
     <w:unhideWhenUsed/>
     <w:qFormat/>
+    <w:rsid w:val="008B03BE"/>
     <w:pPr>
       <w:keepNext/>
       <w:keepLines/>
-      <w:spacing w:before="280" w:after="80"/>
+      <w:spacing w:before="80" w:after="40"/>
       <w:outlineLvl w:val="3"/>
     </w:pPr>
     <w:rPr>
-      <w:color w:val="666666"/>
-      <w:sz w:val="24"/>
-      <w:szCs w:val="24"/>
+      <w:rFonts w:eastAsiaTheme="majorEastAsia" w:cstheme="majorBidi"/>
+      <w:i/>
+      <w:iCs/>
+      <w:color w:val="2F5496" w:themeColor="accent1" w:themeShade="BF"/>
     </w:rPr>
   </w:style>
   <w:style w:type="paragraph" w:styleId="Heading5">
     <w:name w:val="heading 5"/>
     <w:basedOn w:val="Normal"/>
     <w:next w:val="Normal"/>
+    <w:link w:val="Heading5Char"/>
     <w:uiPriority w:val="9"/>
     <w:semiHidden/>
     <w:unhideWhenUsed/>
     <w:qFormat/>
+    <w:rsid w:val="008B03BE"/>
     <w:pPr>
       <w:keepNext/>
       <w:keepLines/>
-      <w:spacing w:before="240" w:after="80"/>
+      <w:spacing w:before="80" w:after="40"/>
       <w:outlineLvl w:val="4"/>
     </w:pPr>
     <w:rPr>
-      <w:color w:val="666666"/>
+      <w:rFonts w:eastAsiaTheme="majorEastAsia" w:cstheme="majorBidi"/>
+      <w:color w:val="2F5496" w:themeColor="accent1" w:themeShade="BF"/>
     </w:rPr>
   </w:style>
   <w:style w:type="paragraph" w:styleId="Heading6">
     <w:name w:val="heading 6"/>
     <w:basedOn w:val="Normal"/>
     <w:next w:val="Normal"/>
+    <w:link w:val="Heading6Char"/>
     <w:uiPriority w:val="9"/>
     <w:semiHidden/>
     <w:unhideWhenUsed/>
     <w:qFormat/>
+    <w:rsid w:val="008B03BE"/>
     <w:pPr>
       <w:keepNext/>
       <w:keepLines/>
-      <w:spacing w:before="240" w:after="80"/>
+      <w:spacing w:before="40" w:after="0"/>
       <w:outlineLvl w:val="5"/>
     </w:pPr>
     <w:rPr>
+      <w:rFonts w:eastAsiaTheme="majorEastAsia" w:cstheme="majorBidi"/>
       <w:i/>
       <w:iCs/>
-      <w:color w:val="666666"/>
+      <w:color w:val="595959" w:themeColor="text1" w:themeTint="A6"/>
+    </w:rPr>
+  </w:style>
+  <w:style w:type="paragraph" w:styleId="Heading7">
+    <w:name w:val="heading 7"/>
+    <w:basedOn w:val="Normal"/>
+    <w:next w:val="Normal"/>
+    <w:link w:val="Heading7Char"/>
+    <w:uiPriority w:val="9"/>
+    <w:semiHidden/>
+    <w:unhideWhenUsed/>
+    <w:qFormat/>
+    <w:rsid w:val="008B03BE"/>
+    <w:pPr>
+      <w:keepNext/>
+      <w:keepLines/>
+      <w:spacing w:before="40" w:after="0"/>
+      <w:outlineLvl w:val="6"/>
+    </w:pPr>
+    <w:rPr>
+      <w:rFonts w:eastAsiaTheme="majorEastAsia" w:cstheme="majorBidi"/>
+      <w:color w:val="595959" w:themeColor="text1" w:themeTint="A6"/>
+    </w:rPr>
+  </w:style>
+  <w:style w:type="paragraph" w:styleId="Heading8">
+    <w:name w:val="heading 8"/>
+    <w:basedOn w:val="Normal"/>
+    <w:next w:val="Normal"/>
+    <w:link w:val="Heading8Char"/>
+    <w:uiPriority w:val="9"/>
+    <w:semiHidden/>
+    <w:unhideWhenUsed/>
+    <w:qFormat/>
+    <w:rsid w:val="008B03BE"/>
+    <w:pPr>
+      <w:keepNext/>
+      <w:keepLines/>
+      <w:spacing w:after="0"/>
+      <w:outlineLvl w:val="7"/>
+    </w:pPr>
+    <w:rPr>
+      <w:rFonts w:eastAsiaTheme="majorEastAsia" w:cstheme="majorBidi"/>
+      <w:i/>
+      <w:iCs/>
+      <w:color w:val="272727" w:themeColor="text1" w:themeTint="D8"/>
+    </w:rPr>
+  </w:style>
+  <w:style w:type="paragraph" w:styleId="Heading9">
+    <w:name w:val="heading 9"/>
+    <w:basedOn w:val="Normal"/>
+    <w:next w:val="Normal"/>
+    <w:link w:val="Heading9Char"/>
+    <w:uiPriority w:val="9"/>
+    <w:semiHidden/>
+    <w:unhideWhenUsed/>
+    <w:qFormat/>
+    <w:rsid w:val="008B03BE"/>
+    <w:pPr>
+      <w:keepNext/>
+      <w:keepLines/>
+      <w:spacing w:after="0"/>
+      <w:outlineLvl w:val="8"/>
+    </w:pPr>
+    <w:rPr>
+      <w:rFonts w:eastAsiaTheme="majorEastAsia" w:cstheme="majorBidi"/>
+      <w:color w:val="272727" w:themeColor="text1" w:themeTint="D8"/>
     </w:rPr>
   </w:style>
   <w:style w:type="character" w:default="1" w:styleId="DefaultParagraphFont">
@@ -5433,63 +4957,295 @@
     <w:semiHidden/>
     <w:unhideWhenUsed/>
   </w:style>
-  <w:style w:type="table" w:customStyle="1" w:styleId="TableNormal0">
-    <w:name w:val="TableNormal"/>
-    <w:tblPr>
-      <w:tblCellMar>
-        <w:top w:w="100" w:type="dxa"/>
-        <w:left w:w="100" w:type="dxa"/>
-        <w:bottom w:w="100" w:type="dxa"/>
-        <w:right w:w="100" w:type="dxa"/>
-      </w:tblCellMar>
-    </w:tblPr>
+  <w:style w:type="character" w:customStyle="1" w:styleId="Heading1Char">
+    <w:name w:val="Heading 1 Char"/>
+    <w:basedOn w:val="DefaultParagraphFont"/>
+    <w:link w:val="Heading1"/>
+    <w:uiPriority w:val="9"/>
+    <w:rsid w:val="008B03BE"/>
+    <w:rPr>
+      <w:rFonts w:asciiTheme="majorHAnsi" w:eastAsiaTheme="majorEastAsia" w:hAnsiTheme="majorHAnsi" w:cstheme="majorBidi"/>
+      <w:color w:val="2F5496" w:themeColor="accent1" w:themeShade="BF"/>
+      <w:sz w:val="40"/>
+      <w:szCs w:val="40"/>
+    </w:rPr>
+  </w:style>
+  <w:style w:type="character" w:customStyle="1" w:styleId="Heading2Char">
+    <w:name w:val="Heading 2 Char"/>
+    <w:basedOn w:val="DefaultParagraphFont"/>
+    <w:link w:val="Heading2"/>
+    <w:uiPriority w:val="9"/>
+    <w:semiHidden/>
+    <w:rsid w:val="008B03BE"/>
+    <w:rPr>
+      <w:rFonts w:asciiTheme="majorHAnsi" w:eastAsiaTheme="majorEastAsia" w:hAnsiTheme="majorHAnsi" w:cstheme="majorBidi"/>
+      <w:color w:val="2F5496" w:themeColor="accent1" w:themeShade="BF"/>
+      <w:sz w:val="32"/>
+      <w:szCs w:val="32"/>
+    </w:rPr>
+  </w:style>
+  <w:style w:type="character" w:customStyle="1" w:styleId="Heading3Char">
+    <w:name w:val="Heading 3 Char"/>
+    <w:basedOn w:val="DefaultParagraphFont"/>
+    <w:link w:val="Heading3"/>
+    <w:uiPriority w:val="9"/>
+    <w:semiHidden/>
+    <w:rsid w:val="008B03BE"/>
+    <w:rPr>
+      <w:rFonts w:eastAsiaTheme="majorEastAsia" w:cstheme="majorBidi"/>
+      <w:color w:val="2F5496" w:themeColor="accent1" w:themeShade="BF"/>
+      <w:sz w:val="28"/>
+      <w:szCs w:val="28"/>
+    </w:rPr>
+  </w:style>
+  <w:style w:type="character" w:customStyle="1" w:styleId="Heading4Char">
+    <w:name w:val="Heading 4 Char"/>
+    <w:basedOn w:val="DefaultParagraphFont"/>
+    <w:link w:val="Heading4"/>
+    <w:uiPriority w:val="9"/>
+    <w:semiHidden/>
+    <w:rsid w:val="008B03BE"/>
+    <w:rPr>
+      <w:rFonts w:eastAsiaTheme="majorEastAsia" w:cstheme="majorBidi"/>
+      <w:i/>
+      <w:iCs/>
+      <w:color w:val="2F5496" w:themeColor="accent1" w:themeShade="BF"/>
+    </w:rPr>
+  </w:style>
+  <w:style w:type="character" w:customStyle="1" w:styleId="Heading5Char">
+    <w:name w:val="Heading 5 Char"/>
+    <w:basedOn w:val="DefaultParagraphFont"/>
+    <w:link w:val="Heading5"/>
+    <w:uiPriority w:val="9"/>
+    <w:semiHidden/>
+    <w:rsid w:val="008B03BE"/>
+    <w:rPr>
+      <w:rFonts w:eastAsiaTheme="majorEastAsia" w:cstheme="majorBidi"/>
+      <w:color w:val="2F5496" w:themeColor="accent1" w:themeShade="BF"/>
+    </w:rPr>
+  </w:style>
+  <w:style w:type="character" w:customStyle="1" w:styleId="Heading6Char">
+    <w:name w:val="Heading 6 Char"/>
+    <w:basedOn w:val="DefaultParagraphFont"/>
+    <w:link w:val="Heading6"/>
+    <w:uiPriority w:val="9"/>
+    <w:semiHidden/>
+    <w:rsid w:val="008B03BE"/>
+    <w:rPr>
+      <w:rFonts w:eastAsiaTheme="majorEastAsia" w:cstheme="majorBidi"/>
+      <w:i/>
+      <w:iCs/>
+      <w:color w:val="595959" w:themeColor="text1" w:themeTint="A6"/>
+    </w:rPr>
+  </w:style>
+  <w:style w:type="character" w:customStyle="1" w:styleId="Heading7Char">
+    <w:name w:val="Heading 7 Char"/>
+    <w:basedOn w:val="DefaultParagraphFont"/>
+    <w:link w:val="Heading7"/>
+    <w:uiPriority w:val="9"/>
+    <w:semiHidden/>
+    <w:rsid w:val="008B03BE"/>
+    <w:rPr>
+      <w:rFonts w:eastAsiaTheme="majorEastAsia" w:cstheme="majorBidi"/>
+      <w:color w:val="595959" w:themeColor="text1" w:themeTint="A6"/>
+    </w:rPr>
+  </w:style>
+  <w:style w:type="character" w:customStyle="1" w:styleId="Heading8Char">
+    <w:name w:val="Heading 8 Char"/>
+    <w:basedOn w:val="DefaultParagraphFont"/>
+    <w:link w:val="Heading8"/>
+    <w:uiPriority w:val="9"/>
+    <w:semiHidden/>
+    <w:rsid w:val="008B03BE"/>
+    <w:rPr>
+      <w:rFonts w:eastAsiaTheme="majorEastAsia" w:cstheme="majorBidi"/>
+      <w:i/>
+      <w:iCs/>
+      <w:color w:val="272727" w:themeColor="text1" w:themeTint="D8"/>
+    </w:rPr>
+  </w:style>
+  <w:style w:type="character" w:customStyle="1" w:styleId="Heading9Char">
+    <w:name w:val="Heading 9 Char"/>
+    <w:basedOn w:val="DefaultParagraphFont"/>
+    <w:link w:val="Heading9"/>
+    <w:uiPriority w:val="9"/>
+    <w:semiHidden/>
+    <w:rsid w:val="008B03BE"/>
+    <w:rPr>
+      <w:rFonts w:eastAsiaTheme="majorEastAsia" w:cstheme="majorBidi"/>
+      <w:color w:val="272727" w:themeColor="text1" w:themeTint="D8"/>
+    </w:rPr>
   </w:style>
   <w:style w:type="paragraph" w:styleId="Title">
     <w:name w:val="Title"/>
     <w:basedOn w:val="Normal"/>
     <w:next w:val="Normal"/>
+    <w:link w:val="TitleChar"/>
     <w:uiPriority w:val="10"/>
     <w:qFormat/>
+    <w:rsid w:val="008B03BE"/>
     <w:pPr>
-      <w:keepNext/>
-      <w:keepLines/>
-      <w:spacing w:after="60"/>
+      <w:spacing w:after="80" w:line="240" w:lineRule="auto"/>
+      <w:contextualSpacing/>
     </w:pPr>
     <w:rPr>
-      <w:sz w:val="52"/>
-      <w:szCs w:val="52"/>
+      <w:rFonts w:asciiTheme="majorHAnsi" w:eastAsiaTheme="majorEastAsia" w:hAnsiTheme="majorHAnsi" w:cstheme="majorBidi"/>
+      <w:spacing w:val="-10"/>
+      <w:kern w:val="28"/>
+      <w:sz w:val="56"/>
+      <w:szCs w:val="56"/>
+    </w:rPr>
+  </w:style>
+  <w:style w:type="character" w:customStyle="1" w:styleId="TitleChar">
+    <w:name w:val="Title Char"/>
+    <w:basedOn w:val="DefaultParagraphFont"/>
+    <w:link w:val="Title"/>
+    <w:uiPriority w:val="10"/>
+    <w:rsid w:val="008B03BE"/>
+    <w:rPr>
+      <w:rFonts w:asciiTheme="majorHAnsi" w:eastAsiaTheme="majorEastAsia" w:hAnsiTheme="majorHAnsi" w:cstheme="majorBidi"/>
+      <w:spacing w:val="-10"/>
+      <w:kern w:val="28"/>
+      <w:sz w:val="56"/>
+      <w:szCs w:val="56"/>
     </w:rPr>
   </w:style>
   <w:style w:type="paragraph" w:styleId="Subtitle">
     <w:name w:val="Subtitle"/>
     <w:basedOn w:val="Normal"/>
     <w:next w:val="Normal"/>
+    <w:link w:val="SubtitleChar"/>
     <w:uiPriority w:val="11"/>
     <w:qFormat/>
+    <w:rsid w:val="008B03BE"/>
     <w:pPr>
-      <w:keepNext/>
-      <w:keepLines/>
-      <w:spacing w:after="320"/>
+      <w:numPr>
+        <w:ilvl w:val="1"/>
+      </w:numPr>
     </w:pPr>
     <w:rPr>
-      <w:color w:val="666666"/>
-      <w:sz w:val="30"/>
-      <w:szCs w:val="30"/>
+      <w:rFonts w:eastAsiaTheme="majorEastAsia" w:cstheme="majorBidi"/>
+      <w:color w:val="595959" w:themeColor="text1" w:themeTint="A6"/>
+      <w:spacing w:val="15"/>
+      <w:sz w:val="28"/>
+      <w:szCs w:val="28"/>
     </w:rPr>
   </w:style>
-  <w:style w:type="table" w:customStyle="1" w:styleId="a">
-    <w:basedOn w:val="TableNormal0"/>
-    <w:tblPr>
-      <w:tblStyleRowBandSize w:val="1"/>
-      <w:tblStyleColBandSize w:val="1"/>
-    </w:tblPr>
+  <w:style w:type="character" w:customStyle="1" w:styleId="SubtitleChar">
+    <w:name w:val="Subtitle Char"/>
+    <w:basedOn w:val="DefaultParagraphFont"/>
+    <w:link w:val="Subtitle"/>
+    <w:uiPriority w:val="11"/>
+    <w:rsid w:val="008B03BE"/>
+    <w:rPr>
+      <w:rFonts w:eastAsiaTheme="majorEastAsia" w:cstheme="majorBidi"/>
+      <w:color w:val="595959" w:themeColor="text1" w:themeTint="A6"/>
+      <w:spacing w:val="15"/>
+      <w:sz w:val="28"/>
+      <w:szCs w:val="28"/>
+    </w:rPr>
   </w:style>
-  <w:style w:type="table" w:customStyle="1" w:styleId="a0">
-    <w:basedOn w:val="TableNormal0"/>
-    <w:tblPr>
-      <w:tblStyleRowBandSize w:val="1"/>
-      <w:tblStyleColBandSize w:val="1"/>
-    </w:tblPr>
+  <w:style w:type="paragraph" w:styleId="Quote">
+    <w:name w:val="Quote"/>
+    <w:basedOn w:val="Normal"/>
+    <w:next w:val="Normal"/>
+    <w:link w:val="QuoteChar"/>
+    <w:uiPriority w:val="29"/>
+    <w:qFormat/>
+    <w:rsid w:val="008B03BE"/>
+    <w:pPr>
+      <w:spacing w:before="160"/>
+      <w:jc w:val="center"/>
+    </w:pPr>
+    <w:rPr>
+      <w:i/>
+      <w:iCs/>
+      <w:color w:val="404040" w:themeColor="text1" w:themeTint="BF"/>
+    </w:rPr>
+  </w:style>
+  <w:style w:type="character" w:customStyle="1" w:styleId="QuoteChar">
+    <w:name w:val="Quote Char"/>
+    <w:basedOn w:val="DefaultParagraphFont"/>
+    <w:link w:val="Quote"/>
+    <w:uiPriority w:val="29"/>
+    <w:rsid w:val="008B03BE"/>
+    <w:rPr>
+      <w:i/>
+      <w:iCs/>
+      <w:color w:val="404040" w:themeColor="text1" w:themeTint="BF"/>
+    </w:rPr>
+  </w:style>
+  <w:style w:type="paragraph" w:styleId="ListParagraph">
+    <w:name w:val="List Paragraph"/>
+    <w:basedOn w:val="Normal"/>
+    <w:uiPriority w:val="34"/>
+    <w:qFormat/>
+    <w:rsid w:val="008B03BE"/>
+    <w:pPr>
+      <w:ind w:left="720"/>
+      <w:contextualSpacing/>
+    </w:pPr>
+  </w:style>
+  <w:style w:type="character" w:styleId="IntenseEmphasis">
+    <w:name w:val="Intense Emphasis"/>
+    <w:basedOn w:val="DefaultParagraphFont"/>
+    <w:uiPriority w:val="21"/>
+    <w:qFormat/>
+    <w:rsid w:val="008B03BE"/>
+    <w:rPr>
+      <w:i/>
+      <w:iCs/>
+      <w:color w:val="2F5496" w:themeColor="accent1" w:themeShade="BF"/>
+    </w:rPr>
+  </w:style>
+  <w:style w:type="paragraph" w:styleId="IntenseQuote">
+    <w:name w:val="Intense Quote"/>
+    <w:basedOn w:val="Normal"/>
+    <w:next w:val="Normal"/>
+    <w:link w:val="IntenseQuoteChar"/>
+    <w:uiPriority w:val="30"/>
+    <w:qFormat/>
+    <w:rsid w:val="008B03BE"/>
+    <w:pPr>
+      <w:pBdr>
+        <w:top w:val="single" w:sz="4" w:space="10" w:color="2F5496" w:themeColor="accent1" w:themeShade="BF"/>
+        <w:bottom w:val="single" w:sz="4" w:space="10" w:color="2F5496" w:themeColor="accent1" w:themeShade="BF"/>
+      </w:pBdr>
+      <w:spacing w:before="360" w:after="360"/>
+      <w:ind w:left="864" w:right="864"/>
+      <w:jc w:val="center"/>
+    </w:pPr>
+    <w:rPr>
+      <w:i/>
+      <w:iCs/>
+      <w:color w:val="2F5496" w:themeColor="accent1" w:themeShade="BF"/>
+    </w:rPr>
+  </w:style>
+  <w:style w:type="character" w:customStyle="1" w:styleId="IntenseQuoteChar">
+    <w:name w:val="Intense Quote Char"/>
+    <w:basedOn w:val="DefaultParagraphFont"/>
+    <w:link w:val="IntenseQuote"/>
+    <w:uiPriority w:val="30"/>
+    <w:rsid w:val="008B03BE"/>
+    <w:rPr>
+      <w:i/>
+      <w:iCs/>
+      <w:color w:val="2F5496" w:themeColor="accent1" w:themeShade="BF"/>
+    </w:rPr>
+  </w:style>
+  <w:style w:type="character" w:styleId="IntenseReference">
+    <w:name w:val="Intense Reference"/>
+    <w:basedOn w:val="DefaultParagraphFont"/>
+    <w:uiPriority w:val="32"/>
+    <w:qFormat/>
+    <w:rsid w:val="008B03BE"/>
+    <w:rPr>
+      <w:b/>
+      <w:bCs/>
+      <w:smallCaps/>
+      <w:color w:val="2F5496" w:themeColor="accent1" w:themeShade="BF"/>
+      <w:spacing w:val="5"/>
+    </w:rPr>
   </w:style>
 </w:styles>
 </file>
@@ -5505,44 +5261,44 @@
         <a:sysClr val="window" lastClr="FFFFFF"/>
       </a:lt1>
       <a:dk2>
-        <a:srgbClr val="1F497D"/>
+        <a:srgbClr val="44546A"/>
       </a:dk2>
       <a:lt2>
-        <a:srgbClr val="EEECE1"/>
+        <a:srgbClr val="E7E6E6"/>
       </a:lt2>
       <a:accent1>
-        <a:srgbClr val="4F81BD"/>
+        <a:srgbClr val="4472C4"/>
       </a:accent1>
       <a:accent2>
-        <a:srgbClr val="C0504D"/>
+        <a:srgbClr val="ED7D31"/>
       </a:accent2>
       <a:accent3>
-        <a:srgbClr val="9BBB59"/>
+        <a:srgbClr val="A5A5A5"/>
       </a:accent3>
       <a:accent4>
-        <a:srgbClr val="8064A2"/>
+        <a:srgbClr val="FFC000"/>
       </a:accent4>
       <a:accent5>
-        <a:srgbClr val="4BACC6"/>
+        <a:srgbClr val="5B9BD5"/>
       </a:accent5>
       <a:accent6>
-        <a:srgbClr val="F79646"/>
+        <a:srgbClr val="70AD47"/>
       </a:accent6>
       <a:hlink>
-        <a:srgbClr val="0000FF"/>
+        <a:srgbClr val="0563C1"/>
       </a:hlink>
       <a:folHlink>
-        <a:srgbClr val="800080"/>
+        <a:srgbClr val="954F72"/>
       </a:folHlink>
     </a:clrScheme>
     <a:fontScheme name="Office">
       <a:majorFont>
-        <a:latin typeface="Calibri"/>
+        <a:latin typeface="Calibri Light" panose="020F0302020204030204"/>
         <a:ea typeface=""/>
         <a:cs typeface=""/>
-        <a:font script="Jpan" typeface="ＭＳ ゴシック"/>
+        <a:font script="Jpan" typeface="游ゴシック Light"/>
         <a:font script="Hang" typeface="맑은 고딕"/>
-        <a:font script="Hans" typeface="宋体"/>
+        <a:font script="Hans" typeface="等线 Light"/>
         <a:font script="Hant" typeface="新細明體"/>
         <a:font script="Arab" typeface="Times New Roman"/>
         <a:font script="Hebr" typeface="Times New Roman"/>
@@ -5570,14 +5326,31 @@
         <a:font script="Viet" typeface="Times New Roman"/>
         <a:font script="Uigh" typeface="Microsoft Uighur"/>
         <a:font script="Geor" typeface="Sylfaen"/>
+        <a:font script="Armn" typeface="Arial"/>
+        <a:font script="Bugi" typeface="Leelawadee UI"/>
+        <a:font script="Bopo" typeface="Microsoft JhengHei"/>
+        <a:font script="Java" typeface="Javanese Text"/>
+        <a:font script="Lisu" typeface="Segoe UI"/>
+        <a:font script="Mymr" typeface="Myanmar Text"/>
+        <a:font script="Nkoo" typeface="Ebrima"/>
+        <a:font script="Olck" typeface="Nirmala UI"/>
+        <a:font script="Osma" typeface="Ebrima"/>
+        <a:font script="Phag" typeface="Phagspa"/>
+        <a:font script="Syrn" typeface="Estrangelo Edessa"/>
+        <a:font script="Syrj" typeface="Estrangelo Edessa"/>
+        <a:font script="Syre" typeface="Estrangelo Edessa"/>
+        <a:font script="Sora" typeface="Nirmala UI"/>
+        <a:font script="Tale" typeface="Microsoft Tai Le"/>
+        <a:font script="Talu" typeface="Microsoft New Tai Lue"/>
+        <a:font script="Tfng" typeface="Ebrima"/>
       </a:majorFont>
       <a:minorFont>
-        <a:latin typeface="Cambria"/>
+        <a:latin typeface="Calibri" panose="020F0502020204030204"/>
         <a:ea typeface=""/>
         <a:cs typeface=""/>
-        <a:font script="Jpan" typeface="ＭＳ 明朝"/>
+        <a:font script="Jpan" typeface="游ゴシック"/>
         <a:font script="Hang" typeface="맑은 고딕"/>
-        <a:font script="Hans" typeface="宋体"/>
+        <a:font script="Hans" typeface="等线"/>
         <a:font script="Hant" typeface="新細明體"/>
         <a:font script="Arab" typeface="Arial"/>
         <a:font script="Hebr" typeface="Arial"/>
@@ -5605,6 +5378,23 @@
         <a:font script="Viet" typeface="Arial"/>
         <a:font script="Uigh" typeface="Microsoft Uighur"/>
         <a:font script="Geor" typeface="Sylfaen"/>
+        <a:font script="Armn" typeface="Arial"/>
+        <a:font script="Bugi" typeface="Leelawadee UI"/>
+        <a:font script="Bopo" typeface="Microsoft JhengHei"/>
+        <a:font script="Java" typeface="Javanese Text"/>
+        <a:font script="Lisu" typeface="Segoe UI"/>
+        <a:font script="Mymr" typeface="Myanmar Text"/>
+        <a:font script="Nkoo" typeface="Ebrima"/>
+        <a:font script="Olck" typeface="Nirmala UI"/>
+        <a:font script="Osma" typeface="Ebrima"/>
+        <a:font script="Phag" typeface="Phagspa"/>
+        <a:font script="Syrn" typeface="Estrangelo Edessa"/>
+        <a:font script="Syrj" typeface="Estrangelo Edessa"/>
+        <a:font script="Syre" typeface="Estrangelo Edessa"/>
+        <a:font script="Sora" typeface="Nirmala UI"/>
+        <a:font script="Tale" typeface="Microsoft Tai Le"/>
+        <a:font script="Talu" typeface="Microsoft New Tai Lue"/>
+        <a:font script="Tfng" typeface="Ebrima"/>
       </a:minorFont>
     </a:fontScheme>
     <a:fmtScheme name="Office">
@@ -5616,200 +5406,141 @@
           <a:gsLst>
             <a:gs pos="0">
               <a:schemeClr val="phClr">
-                <a:tint val="50000"/>
-                <a:satMod val="300000"/>
+                <a:lumMod val="110000"/>
+                <a:satMod val="105000"/>
+                <a:tint val="67000"/>
               </a:schemeClr>
             </a:gs>
-            <a:gs pos="35000">
+            <a:gs pos="50000">
               <a:schemeClr val="phClr">
-                <a:tint val="37000"/>
-                <a:satMod val="300000"/>
+                <a:lumMod val="105000"/>
+                <a:satMod val="103000"/>
+                <a:tint val="73000"/>
               </a:schemeClr>
             </a:gs>
             <a:gs pos="100000">
               <a:schemeClr val="phClr">
-                <a:tint val="15000"/>
-                <a:satMod val="350000"/>
+                <a:lumMod val="105000"/>
+                <a:satMod val="109000"/>
+                <a:tint val="81000"/>
               </a:schemeClr>
             </a:gs>
           </a:gsLst>
-          <a:lin ang="16200000" scaled="1"/>
+          <a:lin ang="5400000" scaled="0"/>
         </a:gradFill>
         <a:gradFill rotWithShape="1">
           <a:gsLst>
             <a:gs pos="0">
               <a:schemeClr val="phClr">
-                <a:tint val="100000"/>
+                <a:satMod val="103000"/>
+                <a:lumMod val="102000"/>
+                <a:tint val="94000"/>
+              </a:schemeClr>
+            </a:gs>
+            <a:gs pos="50000">
+              <a:schemeClr val="phClr">
+                <a:satMod val="110000"/>
+                <a:lumMod val="100000"/>
                 <a:shade val="100000"/>
-                <a:satMod val="130000"/>
               </a:schemeClr>
             </a:gs>
             <a:gs pos="100000">
               <a:schemeClr val="phClr">
-                <a:tint val="50000"/>
-                <a:shade val="100000"/>
-                <a:satMod val="350000"/>
+                <a:lumMod val="99000"/>
+                <a:satMod val="120000"/>
+                <a:shade val="78000"/>
               </a:schemeClr>
             </a:gs>
           </a:gsLst>
-          <a:lin ang="16200000" scaled="0"/>
+          <a:lin ang="5400000" scaled="0"/>
         </a:gradFill>
       </a:fillStyleLst>
       <a:lnStyleLst>
-        <a:ln w="9525" cap="flat" cmpd="sng" algn="ctr">
-          <a:solidFill>
-            <a:schemeClr val="phClr">
-              <a:shade val="95000"/>
-              <a:satMod val="105000"/>
-            </a:schemeClr>
-          </a:solidFill>
-          <a:prstDash val="solid"/>
-        </a:ln>
-        <a:ln w="25400" cap="flat" cmpd="sng" algn="ctr">
+        <a:ln w="6350" cap="flat" cmpd="sng" algn="ctr">
           <a:solidFill>
             <a:schemeClr val="phClr"/>
           </a:solidFill>
           <a:prstDash val="solid"/>
+          <a:miter lim="800000"/>
         </a:ln>
-        <a:ln w="38100" cap="flat" cmpd="sng" algn="ctr">
+        <a:ln w="12700" cap="flat" cmpd="sng" algn="ctr">
           <a:solidFill>
             <a:schemeClr val="phClr"/>
           </a:solidFill>
           <a:prstDash val="solid"/>
+          <a:miter lim="800000"/>
+        </a:ln>
+        <a:ln w="19050" cap="flat" cmpd="sng" algn="ctr">
+          <a:solidFill>
+            <a:schemeClr val="phClr"/>
+          </a:solidFill>
+          <a:prstDash val="solid"/>
+          <a:miter lim="800000"/>
         </a:ln>
       </a:lnStyleLst>
       <a:effectStyleLst>
         <a:effectStyle>
+          <a:effectLst/>
+        </a:effectStyle>
+        <a:effectStyle>
+          <a:effectLst/>
+        </a:effectStyle>
+        <a:effectStyle>
           <a:effectLst>
-            <a:outerShdw blurRad="40000" dist="20000" dir="5400000" rotWithShape="0">
+            <a:outerShdw blurRad="57150" dist="19050" dir="5400000" algn="ctr" rotWithShape="0">
               <a:srgbClr val="000000">
-                <a:alpha val="38000"/>
+                <a:alpha val="63000"/>
               </a:srgbClr>
             </a:outerShdw>
           </a:effectLst>
-        </a:effectStyle>
-        <a:effectStyle>
-          <a:effectLst>
-            <a:outerShdw blurRad="40000" dist="23000" dir="5400000" rotWithShape="0">
-              <a:srgbClr val="000000">
-                <a:alpha val="35000"/>
-              </a:srgbClr>
-            </a:outerShdw>
-          </a:effectLst>
-        </a:effectStyle>
-        <a:effectStyle>
-          <a:effectLst>
-            <a:outerShdw blurRad="40000" dist="23000" dir="5400000" rotWithShape="0">
-              <a:srgbClr val="000000">
-                <a:alpha val="35000"/>
-              </a:srgbClr>
-            </a:outerShdw>
-          </a:effectLst>
-          <a:scene3d>
-            <a:camera prst="orthographicFront">
-              <a:rot lat="0" lon="0" rev="0"/>
-            </a:camera>
-            <a:lightRig rig="threePt" dir="t">
-              <a:rot lat="0" lon="0" rev="1200000"/>
-            </a:lightRig>
-          </a:scene3d>
-          <a:sp3d>
-            <a:bevelT w="63500" h="25400"/>
-          </a:sp3d>
         </a:effectStyle>
       </a:effectStyleLst>
       <a:bgFillStyleLst>
         <a:solidFill>
           <a:schemeClr val="phClr"/>
         </a:solidFill>
+        <a:solidFill>
+          <a:schemeClr val="phClr">
+            <a:tint val="95000"/>
+            <a:satMod val="170000"/>
+          </a:schemeClr>
+        </a:solidFill>
         <a:gradFill rotWithShape="1">
           <a:gsLst>
             <a:gs pos="0">
               <a:schemeClr val="phClr">
-                <a:tint val="40000"/>
-                <a:satMod val="350000"/>
+                <a:tint val="93000"/>
+                <a:satMod val="150000"/>
+                <a:shade val="98000"/>
+                <a:lumMod val="102000"/>
               </a:schemeClr>
             </a:gs>
-            <a:gs pos="40000">
+            <a:gs pos="50000">
               <a:schemeClr val="phClr">
-                <a:tint val="45000"/>
-                <a:shade val="99000"/>
-                <a:satMod val="350000"/>
+                <a:tint val="98000"/>
+                <a:satMod val="130000"/>
+                <a:shade val="90000"/>
+                <a:lumMod val="103000"/>
               </a:schemeClr>
             </a:gs>
             <a:gs pos="100000">
               <a:schemeClr val="phClr">
-                <a:shade val="20000"/>
-                <a:satMod val="255000"/>
+                <a:shade val="63000"/>
+                <a:satMod val="120000"/>
               </a:schemeClr>
             </a:gs>
           </a:gsLst>
-          <a:path path="circle">
-            <a:fillToRect l="50000" t="-80000" r="50000" b="180000"/>
-          </a:path>
-        </a:gradFill>
-        <a:gradFill rotWithShape="1">
-          <a:gsLst>
-            <a:gs pos="0">
-              <a:schemeClr val="phClr">
-                <a:tint val="80000"/>
-                <a:satMod val="300000"/>
-              </a:schemeClr>
-            </a:gs>
-            <a:gs pos="100000">
-              <a:schemeClr val="phClr">
-                <a:shade val="30000"/>
-                <a:satMod val="200000"/>
-              </a:schemeClr>
-            </a:gs>
-          </a:gsLst>
-          <a:path path="circle">
-            <a:fillToRect l="50000" t="50000" r="50000" b="50000"/>
-          </a:path>
+          <a:lin ang="5400000" scaled="0"/>
         </a:gradFill>
       </a:bgFillStyleLst>
     </a:fmtScheme>
   </a:themeElements>
-  <a:objectDefaults>
-    <a:spDef>
-      <a:spPr/>
-      <a:bodyPr/>
-      <a:lstStyle/>
-      <a:style>
-        <a:lnRef idx="1">
-          <a:schemeClr val="accent1"/>
-        </a:lnRef>
-        <a:fillRef idx="3">
-          <a:schemeClr val="accent1"/>
-        </a:fillRef>
-        <a:effectRef idx="2">
-          <a:schemeClr val="accent1"/>
-        </a:effectRef>
-        <a:fontRef idx="minor">
-          <a:schemeClr val="lt1"/>
-        </a:fontRef>
-      </a:style>
-    </a:spDef>
-    <a:lnDef>
-      <a:spPr/>
-      <a:bodyPr/>
-      <a:lstStyle/>
-      <a:style>
-        <a:lnRef idx="2">
-          <a:schemeClr val="accent1"/>
-        </a:lnRef>
-        <a:fillRef idx="0">
-          <a:schemeClr val="accent1"/>
-        </a:fillRef>
-        <a:effectRef idx="1">
-          <a:schemeClr val="accent1"/>
-        </a:effectRef>
-        <a:fontRef idx="minor">
-          <a:schemeClr val="tx1"/>
-        </a:fontRef>
-      </a:style>
-    </a:lnDef>
-  </a:objectDefaults>
+  <a:objectDefaults/>
   <a:extraClrSchemeLst/>
+  <a:extLst>
+    <a:ext uri="{05A4C25C-085E-4340-85A3-A5531E510DB2}">
+      <thm15:themeFamily xmlns:thm15="http://schemas.microsoft.com/office/thememl/2012/main" name="Office Theme" id="{62F939B6-93AF-4DB8-9C6B-D6C7DFDC589F}" vid="{4A3C46E8-61CC-4603-A589-7422A47A8E4A}"/>
+    </a:ext>
+  </a:extLst>
 </a:theme>
 </file>
</xml_diff>